<commit_message>
Ziel beschreibung in der Modulbeschreibung erweitern?
</commit_message>
<xml_diff>
--- a/7_KI-Basismodule/KI-B4/KI-B4.0_Modulbeschreibung.docx
+++ b/7_KI-Basismodule/KI-B4/KI-B4.0_Modulbeschreibung.docx
@@ -531,7 +531,6 @@
           <w:docPartUnique/>
         </w:docPartObj>
       </w:sdtPr>
-      <w:sdtEndPr/>
       <w:sdtContent>
         <w:p>
           <w:pPr>
@@ -2765,9 +2764,13 @@
     </w:p>
     <w:p>
       <w:pPr>
-        <w:rPr>
-          <w:rFonts w:asciiTheme="minorHAnsi" w:hAnsiTheme="minorHAnsi" w:cstheme="minorHAnsi"/>
-        </w:rPr>
+        <w:jc w:val="both"/>
+        <w:rPr>
+          <w:rFonts w:asciiTheme="minorHAnsi" w:hAnsiTheme="minorHAnsi" w:cstheme="minorHAnsi"/>
+        </w:rPr>
+        <w:pPrChange w:id="4" w:author="Imke Endjer" w:date="2023-02-22T11:17:00Z">
+          <w:pPr/>
+        </w:pPrChange>
       </w:pPr>
       <w:r>
         <w:rPr>
@@ -3231,7 +3234,55 @@
                 <w:rFonts w:asciiTheme="minorHAnsi" w:eastAsia="helvetica neue" w:hAnsiTheme="minorHAnsi" w:cstheme="minorHAnsi"/>
                 <w:color w:val="auto"/>
               </w:rPr>
-              <w:t>Nach Abschluss des Teilmoduls können die Schülerinnen und Schüler…</w:t>
+              <w:t xml:space="preserve">Nach Abschluss des Teilmoduls </w:t>
+            </w:r>
+            <w:del w:id="5" w:author="Imke Endjer" w:date="2023-02-22T11:18:00Z">
+              <w:r>
+                <w:rPr>
+                  <w:rFonts w:asciiTheme="minorHAnsi" w:eastAsia="helvetica neue" w:hAnsiTheme="minorHAnsi" w:cstheme="minorHAnsi"/>
+                  <w:color w:val="auto"/>
+                </w:rPr>
+                <w:delText xml:space="preserve">können </w:delText>
+              </w:r>
+            </w:del>
+            <w:ins w:id="6" w:author="Imke Endjer" w:date="2023-02-22T11:18:00Z">
+              <w:r>
+                <w:rPr>
+                  <w:rFonts w:asciiTheme="minorHAnsi" w:eastAsia="helvetica neue" w:hAnsiTheme="minorHAnsi" w:cstheme="minorHAnsi"/>
+                  <w:color w:val="auto"/>
+                </w:rPr>
+                <w:t>sind folgende Ziele erreicht:</w:t>
+              </w:r>
+              <w:r>
+                <w:rPr>
+                  <w:rFonts w:asciiTheme="minorHAnsi" w:eastAsia="helvetica neue" w:hAnsiTheme="minorHAnsi" w:cstheme="minorHAnsi"/>
+                  <w:color w:val="auto"/>
+                </w:rPr>
+                <w:t xml:space="preserve"> </w:t>
+              </w:r>
+              <w:r>
+                <w:rPr>
+                  <w:rFonts w:asciiTheme="minorHAnsi" w:eastAsia="helvetica neue" w:hAnsiTheme="minorHAnsi" w:cstheme="minorHAnsi"/>
+                  <w:color w:val="auto"/>
+                </w:rPr>
+                <w:t>D</w:t>
+              </w:r>
+            </w:ins>
+            <w:del w:id="7" w:author="Imke Endjer" w:date="2023-02-22T11:18:00Z">
+              <w:r>
+                <w:rPr>
+                  <w:rFonts w:asciiTheme="minorHAnsi" w:eastAsia="helvetica neue" w:hAnsiTheme="minorHAnsi" w:cstheme="minorHAnsi"/>
+                  <w:color w:val="auto"/>
+                </w:rPr>
+                <w:delText>d</w:delText>
+              </w:r>
+            </w:del>
+            <w:r>
+              <w:rPr>
+                <w:rFonts w:asciiTheme="minorHAnsi" w:eastAsia="helvetica neue" w:hAnsiTheme="minorHAnsi" w:cstheme="minorHAnsi"/>
+                <w:color w:val="auto"/>
+              </w:rPr>
+              <w:t>ie Schülerinnen und Schüler…</w:t>
             </w:r>
           </w:p>
           <w:p>
@@ -3254,12 +3305,53 @@
                 <w:color w:val="auto"/>
               </w:rPr>
             </w:pPr>
+            <w:del w:id="8" w:author="Imke Endjer" w:date="2023-02-22T11:18:00Z">
+              <w:r>
+                <w:rPr>
+                  <w:rFonts w:asciiTheme="minorHAnsi" w:eastAsia="helvetica neue" w:hAnsiTheme="minorHAnsi" w:cstheme="minorHAnsi"/>
+                  <w:color w:val="auto"/>
+                </w:rPr>
+                <w:delText xml:space="preserve">Probleme </w:delText>
+              </w:r>
+            </w:del>
             <w:r>
               <w:rPr>
                 <w:rFonts w:asciiTheme="minorHAnsi" w:eastAsia="helvetica neue" w:hAnsiTheme="minorHAnsi" w:cstheme="minorHAnsi"/>
                 <w:color w:val="auto"/>
               </w:rPr>
-              <w:t>Probleme erläutern, in denen KI gewinnbringend eingesetzt werden kann (Welche Probleme werden bereits mit KI gelöst?)</w:t>
+              <w:t>erläutern</w:t>
+            </w:r>
+            <w:ins w:id="9" w:author="Imke Endjer" w:date="2023-02-22T11:18:00Z">
+              <w:r>
+                <w:rPr>
+                  <w:rFonts w:asciiTheme="minorHAnsi" w:eastAsia="helvetica neue" w:hAnsiTheme="minorHAnsi" w:cstheme="minorHAnsi"/>
+                  <w:color w:val="auto"/>
+                </w:rPr>
+                <w:t xml:space="preserve"> Probleme</w:t>
+              </w:r>
+            </w:ins>
+            <w:r>
+              <w:rPr>
+                <w:rFonts w:asciiTheme="minorHAnsi" w:eastAsia="helvetica neue" w:hAnsiTheme="minorHAnsi" w:cstheme="minorHAnsi"/>
+                <w:color w:val="auto"/>
+              </w:rPr>
+              <w:t xml:space="preserve">, in denen KI gewinnbringend eingesetzt werden kann (Welche Probleme </w:t>
+            </w:r>
+            <w:proofErr w:type="gramStart"/>
+            <w:r>
+              <w:rPr>
+                <w:rFonts w:asciiTheme="minorHAnsi" w:eastAsia="helvetica neue" w:hAnsiTheme="minorHAnsi" w:cstheme="minorHAnsi"/>
+                <w:color w:val="auto"/>
+              </w:rPr>
+              <w:t>werden</w:t>
+            </w:r>
+            <w:proofErr w:type="gramEnd"/>
+            <w:r>
+              <w:rPr>
+                <w:rFonts w:asciiTheme="minorHAnsi" w:eastAsia="helvetica neue" w:hAnsiTheme="minorHAnsi" w:cstheme="minorHAnsi"/>
+                <w:color w:val="auto"/>
+              </w:rPr>
+              <w:t xml:space="preserve"> bereits mit KI gelöst?)</w:t>
             </w:r>
             <w:r>
               <w:rPr>
@@ -3289,12 +3381,37 @@
                 <w:color w:val="auto"/>
               </w:rPr>
             </w:pPr>
+            <w:ins w:id="10" w:author="Imke Endjer" w:date="2023-02-22T11:18:00Z">
+              <w:r>
+                <w:rPr>
+                  <w:rFonts w:asciiTheme="minorHAnsi" w:eastAsia="helvetica neue" w:hAnsiTheme="minorHAnsi" w:cstheme="minorHAnsi"/>
+                  <w:color w:val="auto"/>
+                </w:rPr>
+                <w:t xml:space="preserve">lösen </w:t>
+              </w:r>
+            </w:ins>
             <w:r>
               <w:rPr>
                 <w:rFonts w:asciiTheme="minorHAnsi" w:eastAsia="helvetica neue" w:hAnsiTheme="minorHAnsi" w:cstheme="minorHAnsi"/>
                 <w:color w:val="auto"/>
               </w:rPr>
-              <w:t>Probleme unter Nutzung von KI-Methoden lösen (Wie kann ich KI nutzen, um Probleme zu lösen?)</w:t>
+              <w:t xml:space="preserve">Probleme unter Nutzung von KI-Methoden </w:t>
+            </w:r>
+            <w:del w:id="11" w:author="Imke Endjer" w:date="2023-02-22T11:18:00Z">
+              <w:r>
+                <w:rPr>
+                  <w:rFonts w:asciiTheme="minorHAnsi" w:eastAsia="helvetica neue" w:hAnsiTheme="minorHAnsi" w:cstheme="minorHAnsi"/>
+                  <w:color w:val="auto"/>
+                </w:rPr>
+                <w:delText xml:space="preserve">lösen </w:delText>
+              </w:r>
+            </w:del>
+            <w:r>
+              <w:rPr>
+                <w:rFonts w:asciiTheme="minorHAnsi" w:eastAsia="helvetica neue" w:hAnsiTheme="minorHAnsi" w:cstheme="minorHAnsi"/>
+                <w:color w:val="auto"/>
+              </w:rPr>
+              <w:t>(Wie kann ich KI nutzen, um Probleme zu lösen?)</w:t>
             </w:r>
             <w:r>
               <w:rPr>
@@ -3324,12 +3441,85 @@
                 <w:color w:val="auto"/>
               </w:rPr>
             </w:pPr>
+            <w:ins w:id="12" w:author="Imke Endjer" w:date="2023-02-22T11:18:00Z">
+              <w:r>
+                <w:rPr>
+                  <w:rFonts w:asciiTheme="minorHAnsi" w:eastAsia="helvetica neue" w:hAnsiTheme="minorHAnsi" w:cstheme="minorHAnsi"/>
+                  <w:color w:val="auto"/>
+                </w:rPr>
+                <w:t>diskutieren und bewerten</w:t>
+              </w:r>
+              <w:r>
+                <w:rPr>
+                  <w:rFonts w:asciiTheme="minorHAnsi" w:eastAsia="helvetica neue" w:hAnsiTheme="minorHAnsi" w:cstheme="minorHAnsi"/>
+                  <w:color w:val="auto"/>
+                </w:rPr>
+                <w:t xml:space="preserve"> </w:t>
+              </w:r>
+            </w:ins>
             <w:r>
               <w:rPr>
                 <w:rFonts w:asciiTheme="minorHAnsi" w:eastAsia="helvetica neue" w:hAnsiTheme="minorHAnsi" w:cstheme="minorHAnsi"/>
                 <w:color w:val="auto"/>
               </w:rPr>
-              <w:t>Konsequenzen aus dem Einsatz von KI-Methoden diskutieren und bewerten. (Welche Konsequenzen hat der Einsatz von KI-Methoden auf uns und unsere Gesellschaft? Wo liegen die Gefahren von KI?)</w:t>
+              <w:t xml:space="preserve">Konsequenzen </w:t>
+            </w:r>
+            <w:del w:id="13" w:author="Imke Endjer" w:date="2023-02-22T11:19:00Z">
+              <w:r>
+                <w:rPr>
+                  <w:rFonts w:asciiTheme="minorHAnsi" w:eastAsia="helvetica neue" w:hAnsiTheme="minorHAnsi" w:cstheme="minorHAnsi"/>
+                  <w:color w:val="auto"/>
+                </w:rPr>
+                <w:delText>aus dem</w:delText>
+              </w:r>
+            </w:del>
+            <w:ins w:id="14" w:author="Imke Endjer" w:date="2023-02-22T11:19:00Z">
+              <w:r>
+                <w:rPr>
+                  <w:rFonts w:asciiTheme="minorHAnsi" w:eastAsia="helvetica neue" w:hAnsiTheme="minorHAnsi" w:cstheme="minorHAnsi"/>
+                  <w:color w:val="auto"/>
+                </w:rPr>
+                <w:t>des</w:t>
+              </w:r>
+            </w:ins>
+            <w:r>
+              <w:rPr>
+                <w:rFonts w:asciiTheme="minorHAnsi" w:eastAsia="helvetica neue" w:hAnsiTheme="minorHAnsi" w:cstheme="minorHAnsi"/>
+                <w:color w:val="auto"/>
+              </w:rPr>
+              <w:t xml:space="preserve"> Einsatz</w:t>
+            </w:r>
+            <w:ins w:id="15" w:author="Imke Endjer" w:date="2023-02-22T11:19:00Z">
+              <w:r>
+                <w:rPr>
+                  <w:rFonts w:asciiTheme="minorHAnsi" w:eastAsia="helvetica neue" w:hAnsiTheme="minorHAnsi" w:cstheme="minorHAnsi"/>
+                  <w:color w:val="auto"/>
+                </w:rPr>
+                <w:t>es</w:t>
+              </w:r>
+            </w:ins>
+            <w:r>
+              <w:rPr>
+                <w:rFonts w:asciiTheme="minorHAnsi" w:eastAsia="helvetica neue" w:hAnsiTheme="minorHAnsi" w:cstheme="minorHAnsi"/>
+                <w:color w:val="auto"/>
+              </w:rPr>
+              <w:t xml:space="preserve"> von KI-Methoden</w:t>
+            </w:r>
+            <w:del w:id="16" w:author="Imke Endjer" w:date="2023-02-22T11:18:00Z">
+              <w:r>
+                <w:rPr>
+                  <w:rFonts w:asciiTheme="minorHAnsi" w:eastAsia="helvetica neue" w:hAnsiTheme="minorHAnsi" w:cstheme="minorHAnsi"/>
+                  <w:color w:val="auto"/>
+                </w:rPr>
+                <w:delText xml:space="preserve"> diskutieren und bewerten</w:delText>
+              </w:r>
+            </w:del>
+            <w:r>
+              <w:rPr>
+                <w:rFonts w:asciiTheme="minorHAnsi" w:eastAsia="helvetica neue" w:hAnsiTheme="minorHAnsi" w:cstheme="minorHAnsi"/>
+                <w:color w:val="auto"/>
+              </w:rPr>
+              <w:t>. (Welche Konsequenzen hat der Einsatz von KI-Methoden auf uns und unsere Gesellschaft? Wo liegen die Gefahren von KI?)</w:t>
             </w:r>
           </w:p>
           <w:p>
@@ -3352,12 +3542,69 @@
                 <w:color w:val="auto"/>
               </w:rPr>
             </w:pPr>
+            <w:ins w:id="17" w:author="Imke Endjer" w:date="2023-02-22T11:19:00Z">
+              <w:r>
+                <w:rPr>
+                  <w:rFonts w:asciiTheme="minorHAnsi" w:eastAsia="helvetica neue" w:hAnsiTheme="minorHAnsi" w:cstheme="minorHAnsi"/>
+                  <w:color w:val="auto"/>
+                </w:rPr>
+                <w:t xml:space="preserve">beschreiben </w:t>
+              </w:r>
+            </w:ins>
             <w:r>
               <w:rPr>
                 <w:rFonts w:asciiTheme="minorHAnsi" w:eastAsia="helvetica neue" w:hAnsiTheme="minorHAnsi" w:cstheme="minorHAnsi"/>
                 <w:color w:val="auto"/>
               </w:rPr>
-              <w:t>Einsatzmöglichkeiten von KI-Methoden als “Werkzeug” bspw. bei der beruflichen Tätigkeit beschreiben (Wie arbeitet ein Data Scientist? Was kann ich mit KI später (beruflich) machen?)</w:t>
+              <w:t xml:space="preserve">Einsatzmöglichkeiten von KI-Methoden als “Werkzeug” bspw. bei </w:t>
+            </w:r>
+            <w:del w:id="18" w:author="Imke Endjer" w:date="2023-02-22T11:19:00Z">
+              <w:r>
+                <w:rPr>
+                  <w:rFonts w:asciiTheme="minorHAnsi" w:eastAsia="helvetica neue" w:hAnsiTheme="minorHAnsi" w:cstheme="minorHAnsi"/>
+                  <w:color w:val="auto"/>
+                </w:rPr>
+                <w:delText xml:space="preserve">der </w:delText>
+              </w:r>
+            </w:del>
+            <w:r>
+              <w:rPr>
+                <w:rFonts w:asciiTheme="minorHAnsi" w:eastAsia="helvetica neue" w:hAnsiTheme="minorHAnsi" w:cstheme="minorHAnsi"/>
+                <w:color w:val="auto"/>
+              </w:rPr>
+              <w:t>beruflichen Tätigkeit</w:t>
+            </w:r>
+            <w:ins w:id="19" w:author="Imke Endjer" w:date="2023-02-22T11:19:00Z">
+              <w:r>
+                <w:rPr>
+                  <w:rFonts w:asciiTheme="minorHAnsi" w:eastAsia="helvetica neue" w:hAnsiTheme="minorHAnsi" w:cstheme="minorHAnsi"/>
+                  <w:color w:val="auto"/>
+                </w:rPr>
+                <w:t>en</w:t>
+              </w:r>
+            </w:ins>
+            <w:r>
+              <w:rPr>
+                <w:rFonts w:asciiTheme="minorHAnsi" w:eastAsia="helvetica neue" w:hAnsiTheme="minorHAnsi" w:cstheme="minorHAnsi"/>
+                <w:color w:val="auto"/>
+              </w:rPr>
+              <w:t xml:space="preserve"> </w:t>
+            </w:r>
+            <w:del w:id="20" w:author="Imke Endjer" w:date="2023-02-22T11:19:00Z">
+              <w:r>
+                <w:rPr>
+                  <w:rFonts w:asciiTheme="minorHAnsi" w:eastAsia="helvetica neue" w:hAnsiTheme="minorHAnsi" w:cstheme="minorHAnsi"/>
+                  <w:color w:val="auto"/>
+                </w:rPr>
+                <w:delText xml:space="preserve">beschreiben </w:delText>
+              </w:r>
+            </w:del>
+            <w:r>
+              <w:rPr>
+                <w:rFonts w:asciiTheme="minorHAnsi" w:eastAsia="helvetica neue" w:hAnsiTheme="minorHAnsi" w:cstheme="minorHAnsi"/>
+                <w:color w:val="auto"/>
+              </w:rPr>
+              <w:t>(Wie arbeitet ein Data Scientist? Was kann ich mit KI später (beruflich) machen?)</w:t>
             </w:r>
             <w:r>
               <w:rPr>
@@ -3690,9 +3937,9 @@
       </w:tr>
     </w:tbl>
     <w:p>
-      <w:bookmarkStart w:id="4" w:name="_Toc83890414"/>
-      <w:bookmarkStart w:id="5" w:name="_Toc83890656"/>
-      <w:bookmarkStart w:id="6" w:name="_Toc90635432"/>
+      <w:bookmarkStart w:id="21" w:name="_Toc83890414"/>
+      <w:bookmarkStart w:id="22" w:name="_Toc83890656"/>
+      <w:bookmarkStart w:id="23" w:name="_Toc90635432"/>
     </w:p>
     <w:p>
       <w:pPr>
@@ -3734,9 +3981,9 @@
         <w:lastRenderedPageBreak/>
         <w:t>Warum gibt es das Modul?</w:t>
       </w:r>
-      <w:bookmarkEnd w:id="4"/>
-      <w:bookmarkEnd w:id="5"/>
-      <w:bookmarkEnd w:id="6"/>
+      <w:bookmarkEnd w:id="21"/>
+      <w:bookmarkEnd w:id="22"/>
+      <w:bookmarkEnd w:id="23"/>
     </w:p>
     <w:p>
       <w:pPr>
@@ -3793,9 +4040,9 @@
           <w:bCs/>
         </w:rPr>
       </w:pPr>
-      <w:bookmarkStart w:id="7" w:name="_Toc83890415"/>
-      <w:bookmarkStart w:id="8" w:name="_Toc83890657"/>
-      <w:bookmarkStart w:id="9" w:name="_Toc90635433"/>
+      <w:bookmarkStart w:id="24" w:name="_Toc83890415"/>
+      <w:bookmarkStart w:id="25" w:name="_Toc83890657"/>
+      <w:bookmarkStart w:id="26" w:name="_Toc90635433"/>
       <w:r>
         <w:rPr>
           <w:rFonts w:asciiTheme="minorHAnsi" w:hAnsiTheme="minorHAnsi" w:cstheme="minorHAnsi"/>
@@ -3803,9 +4050,9 @@
         </w:rPr>
         <w:t>Ziele des Moduls</w:t>
       </w:r>
-      <w:bookmarkEnd w:id="7"/>
-      <w:bookmarkEnd w:id="8"/>
-      <w:bookmarkEnd w:id="9"/>
+      <w:bookmarkEnd w:id="24"/>
+      <w:bookmarkEnd w:id="25"/>
+      <w:bookmarkEnd w:id="26"/>
     </w:p>
     <w:p>
       <w:pPr>
@@ -3813,6 +4060,7 @@
           <w:rFonts w:asciiTheme="minorHAnsi" w:hAnsiTheme="minorHAnsi" w:cstheme="minorHAnsi"/>
         </w:rPr>
       </w:pPr>
+      <w:commentRangeStart w:id="27"/>
       <w:r>
         <w:rPr>
           <w:rFonts w:asciiTheme="minorHAnsi" w:hAnsiTheme="minorHAnsi" w:cstheme="minorHAnsi"/>
@@ -3886,6 +4134,13 @@
           <w:rFonts w:asciiTheme="minorHAnsi" w:hAnsiTheme="minorHAnsi" w:cstheme="minorHAnsi"/>
         </w:rPr>
         <w:t>Aus gesellschaftlich-kultureller Perspektive werden Konsequenzen des Einsatzes von KI-Methoden diskutiert und unter ethischen und moralischen Gesichtspunkten bewertet.</w:t>
+      </w:r>
+      <w:commentRangeEnd w:id="27"/>
+      <w:r>
+        <w:rPr>
+          <w:rStyle w:val="Kommentarzeichen"/>
+        </w:rPr>
+        <w:commentReference w:id="27"/>
       </w:r>
     </w:p>
     <w:p>
@@ -3915,9 +4170,9 @@
           <w:bCs/>
         </w:rPr>
       </w:pPr>
-      <w:bookmarkStart w:id="10" w:name="_Toc83890416"/>
-      <w:bookmarkStart w:id="11" w:name="_Toc83890658"/>
-      <w:bookmarkStart w:id="12" w:name="_Toc90635434"/>
+      <w:bookmarkStart w:id="28" w:name="_Toc83890416"/>
+      <w:bookmarkStart w:id="29" w:name="_Toc83890658"/>
+      <w:bookmarkStart w:id="30" w:name="_Toc90635434"/>
       <w:r>
         <w:rPr>
           <w:rFonts w:asciiTheme="minorHAnsi" w:hAnsiTheme="minorHAnsi" w:cstheme="minorHAnsi"/>
@@ -3926,9 +4181,9 @@
         <w:lastRenderedPageBreak/>
         <w:t>Die Rolle der Unternehmensvertreterin/des Unternehmensvertreters</w:t>
       </w:r>
-      <w:bookmarkEnd w:id="10"/>
-      <w:bookmarkEnd w:id="11"/>
-      <w:bookmarkEnd w:id="12"/>
+      <w:bookmarkEnd w:id="28"/>
+      <w:bookmarkEnd w:id="29"/>
+      <w:bookmarkEnd w:id="30"/>
     </w:p>
     <w:p>
       <w:pPr>
@@ -4144,9 +4399,9 @@
           <w:bCs/>
         </w:rPr>
       </w:pPr>
-      <w:bookmarkStart w:id="13" w:name="_Toc83890417"/>
-      <w:bookmarkStart w:id="14" w:name="_Toc83890659"/>
-      <w:bookmarkStart w:id="15" w:name="_Toc90635435"/>
+      <w:bookmarkStart w:id="31" w:name="_Toc83890417"/>
+      <w:bookmarkStart w:id="32" w:name="_Toc83890659"/>
+      <w:bookmarkStart w:id="33" w:name="_Toc90635435"/>
       <w:r>
         <w:rPr>
           <w:rFonts w:asciiTheme="minorHAnsi" w:hAnsiTheme="minorHAnsi" w:cstheme="minorHAnsi"/>
@@ -4154,9 +4409,9 @@
         </w:rPr>
         <w:t>Inhalte des Moduls</w:t>
       </w:r>
-      <w:bookmarkEnd w:id="13"/>
-      <w:bookmarkEnd w:id="14"/>
-      <w:bookmarkEnd w:id="15"/>
+      <w:bookmarkEnd w:id="31"/>
+      <w:bookmarkEnd w:id="32"/>
+      <w:bookmarkEnd w:id="33"/>
     </w:p>
     <w:p>
       <w:pPr>
@@ -4195,11 +4450,11 @@
         </w:rPr>
         <w:t>). In diesem Modul soll das überwachte Lernen vertieft werden. Hier werden dem Programm beschriftete Trainingsdaten zur Verfügung gestellt, auf deren Grundlage das Programm lernt, auch weiteren Daten eine Beschriftung zuzuordnen. Die wesentlichen Begriffe und Funktionen werden im Folgenden näher erläutert.</w:t>
       </w:r>
-      <w:bookmarkStart w:id="16" w:name="_3znysh7"/>
-      <w:bookmarkStart w:id="17" w:name="_Toc83890418"/>
-      <w:bookmarkStart w:id="18" w:name="_Toc83890660"/>
-      <w:bookmarkStart w:id="19" w:name="_Toc90635436"/>
-      <w:bookmarkEnd w:id="16"/>
+      <w:bookmarkStart w:id="34" w:name="_3znysh7"/>
+      <w:bookmarkStart w:id="35" w:name="_Toc83890418"/>
+      <w:bookmarkStart w:id="36" w:name="_Toc83890660"/>
+      <w:bookmarkStart w:id="37" w:name="_Toc90635436"/>
+      <w:bookmarkEnd w:id="34"/>
     </w:p>
     <w:p>
       <w:pPr>
@@ -4212,9 +4467,9 @@
       <w:r>
         <w:t>Klassifikation</w:t>
       </w:r>
-      <w:bookmarkEnd w:id="17"/>
-      <w:bookmarkEnd w:id="18"/>
-      <w:bookmarkEnd w:id="19"/>
+      <w:bookmarkEnd w:id="35"/>
+      <w:bookmarkEnd w:id="36"/>
+      <w:bookmarkEnd w:id="37"/>
     </w:p>
     <w:p>
       <w:pPr>
@@ -4379,7 +4634,7 @@
                     </pic:cNvPicPr>
                   </pic:nvPicPr>
                   <pic:blipFill>
-                    <a:blip r:embed="rId10"/>
+                    <a:blip r:embed="rId14"/>
                     <a:stretch/>
                   </pic:blipFill>
                   <pic:spPr bwMode="auto">
@@ -4527,7 +4782,7 @@
                     <pic:cNvPicPr/>
                   </pic:nvPicPr>
                   <pic:blipFill>
-                    <a:blip r:embed="rId11"/>
+                    <a:blip r:embed="rId15"/>
                     <a:stretch/>
                   </pic:blipFill>
                   <pic:spPr bwMode="auto">
@@ -4571,7 +4826,7 @@
                     <pic:cNvPicPr/>
                   </pic:nvPicPr>
                   <pic:blipFill>
-                    <a:blip r:embed="rId12"/>
+                    <a:blip r:embed="rId16"/>
                     <a:stretch/>
                   </pic:blipFill>
                   <pic:spPr bwMode="auto">
@@ -4625,7 +4880,7 @@
                     <pic:cNvPicPr/>
                   </pic:nvPicPr>
                   <pic:blipFill>
-                    <a:blip r:embed="rId13"/>
+                    <a:blip r:embed="rId17"/>
                     <a:stretch/>
                   </pic:blipFill>
                   <pic:spPr bwMode="auto">
@@ -4775,7 +5030,7 @@
                     <pic:cNvPicPr/>
                   </pic:nvPicPr>
                   <pic:blipFill>
-                    <a:blip r:embed="rId14"/>
+                    <a:blip r:embed="rId18"/>
                     <a:stretch/>
                   </pic:blipFill>
                   <pic:spPr bwMode="auto">
@@ -4836,7 +5091,7 @@
                     <pic:cNvPicPr/>
                   </pic:nvPicPr>
                   <pic:blipFill>
-                    <a:blip r:embed="rId15"/>
+                    <a:blip r:embed="rId19"/>
                     <a:stretch/>
                   </pic:blipFill>
                   <pic:spPr bwMode="auto">
@@ -4867,7 +5122,21 @@
         <w:rPr>
           <w:rFonts w:asciiTheme="minorHAnsi" w:hAnsiTheme="minorHAnsi" w:cstheme="minorHAnsi"/>
         </w:rPr>
-        <w:t xml:space="preserve">In diesem Falls entscheidet der Mehrheitsbeschluss: Im Beispiel ist die Mehrheit der Äffchen beißend, daher wird die Klasse “beißt” vergeben. In der Software Orange, dem Werkzeug das in diesem Modul genutzt wird, ist das wie folgt visualisiert: </w:t>
+        <w:t xml:space="preserve">In diesem Falls entscheidet der Mehrheitsbeschluss: Im Beispiel ist die Mehrheit der Äffchen beißend, daher wird die Klasse “beißt” vergeben. In der Software Orange, dem </w:t>
+      </w:r>
+      <w:proofErr w:type="gramStart"/>
+      <w:r>
+        <w:rPr>
+          <w:rFonts w:asciiTheme="minorHAnsi" w:hAnsiTheme="minorHAnsi" w:cstheme="minorHAnsi"/>
+        </w:rPr>
+        <w:t>Werkzeug</w:t>
+      </w:r>
+      <w:proofErr w:type="gramEnd"/>
+      <w:r>
+        <w:rPr>
+          <w:rFonts w:asciiTheme="minorHAnsi" w:hAnsiTheme="minorHAnsi" w:cstheme="minorHAnsi"/>
+        </w:rPr>
+        <w:t xml:space="preserve"> das in diesem Modul genutzt wird, ist das wie folgt visualisiert: </w:t>
       </w:r>
     </w:p>
     <w:p>
@@ -4896,7 +5165,7 @@
                     <pic:cNvPicPr/>
                   </pic:nvPicPr>
                   <pic:blipFill>
-                    <a:blip r:embed="rId16"/>
+                    <a:blip r:embed="rId20"/>
                     <a:stretch/>
                   </pic:blipFill>
                   <pic:spPr bwMode="auto">
@@ -4960,11 +5229,11 @@
           <w:bCs/>
         </w:rPr>
       </w:pPr>
-      <w:bookmarkStart w:id="20" w:name="_tyjcwt"/>
-      <w:bookmarkStart w:id="21" w:name="_Toc83890419"/>
-      <w:bookmarkStart w:id="22" w:name="_Toc83890661"/>
-      <w:bookmarkStart w:id="23" w:name="_Toc90635437"/>
-      <w:bookmarkEnd w:id="20"/>
+      <w:bookmarkStart w:id="38" w:name="_tyjcwt"/>
+      <w:bookmarkStart w:id="39" w:name="_Toc83890419"/>
+      <w:bookmarkStart w:id="40" w:name="_Toc83890661"/>
+      <w:bookmarkStart w:id="41" w:name="_Toc90635437"/>
+      <w:bookmarkEnd w:id="38"/>
       <w:r>
         <w:rPr>
           <w:rFonts w:asciiTheme="minorHAnsi" w:hAnsiTheme="minorHAnsi" w:cstheme="minorHAnsi"/>
@@ -4980,9 +5249,9 @@
         </w:rPr>
         <w:t>Underfitting</w:t>
       </w:r>
-      <w:bookmarkEnd w:id="21"/>
-      <w:bookmarkEnd w:id="22"/>
-      <w:bookmarkEnd w:id="23"/>
+      <w:bookmarkEnd w:id="39"/>
+      <w:bookmarkEnd w:id="40"/>
+      <w:bookmarkEnd w:id="41"/>
       <w:proofErr w:type="spellEnd"/>
     </w:p>
     <w:p>
@@ -5136,7 +5405,7 @@
                     <pic:cNvPicPr/>
                   </pic:nvPicPr>
                   <pic:blipFill>
-                    <a:blip r:embed="rId17"/>
+                    <a:blip r:embed="rId21"/>
                     <a:stretch/>
                   </pic:blipFill>
                   <pic:spPr bwMode="auto">
@@ -5244,11 +5513,11 @@
           <w:bCs/>
         </w:rPr>
       </w:pPr>
-      <w:bookmarkStart w:id="24" w:name="_2et92p0"/>
-      <w:bookmarkStart w:id="25" w:name="_Toc83890420"/>
-      <w:bookmarkStart w:id="26" w:name="_Toc83890662"/>
-      <w:bookmarkStart w:id="27" w:name="_Toc90635438"/>
-      <w:bookmarkEnd w:id="24"/>
+      <w:bookmarkStart w:id="42" w:name="_2et92p0"/>
+      <w:bookmarkStart w:id="43" w:name="_Toc83890420"/>
+      <w:bookmarkStart w:id="44" w:name="_Toc83890662"/>
+      <w:bookmarkStart w:id="45" w:name="_Toc90635438"/>
+      <w:bookmarkEnd w:id="42"/>
       <w:r>
         <w:rPr>
           <w:rFonts w:asciiTheme="minorHAnsi" w:hAnsiTheme="minorHAnsi" w:cstheme="minorHAnsi"/>
@@ -5256,9 +5525,9 @@
         </w:rPr>
         <w:t>Bewertung der Güte eines Modells</w:t>
       </w:r>
-      <w:bookmarkEnd w:id="25"/>
-      <w:bookmarkEnd w:id="26"/>
-      <w:bookmarkEnd w:id="27"/>
+      <w:bookmarkEnd w:id="43"/>
+      <w:bookmarkEnd w:id="44"/>
+      <w:bookmarkEnd w:id="45"/>
       <w:r>
         <w:rPr>
           <w:rFonts w:asciiTheme="minorHAnsi" w:hAnsiTheme="minorHAnsi" w:cstheme="minorHAnsi"/>
@@ -5277,7 +5546,21 @@
         <w:rPr>
           <w:rFonts w:asciiTheme="minorHAnsi" w:hAnsiTheme="minorHAnsi" w:cstheme="minorHAnsi"/>
         </w:rPr>
-        <w:t>Um ein Modell zu testen werden Testdaten verwendet. Auch für diese Testdaten (wie für die Trainingsdaten) ist die Beschriftung, also tatsächliche Klasse der Daten, bekannt. Bei unseren Äffchen wissen wir also, ob sie beißen oder nicht. Um zu bewerten, wie „gut“ das Modell die Testdaten klassifiziert, wird die Güte des Modells bestimmt. Dazu wird das Modell auf die Testdaten angewendet. Anschließend vergleiche wir die vom Modell vorhergesagten mit den eigentlichen Beschriftungen.</w:t>
+        <w:t xml:space="preserve">Um ein Modell zu </w:t>
+      </w:r>
+      <w:proofErr w:type="gramStart"/>
+      <w:r>
+        <w:rPr>
+          <w:rFonts w:asciiTheme="minorHAnsi" w:hAnsiTheme="minorHAnsi" w:cstheme="minorHAnsi"/>
+        </w:rPr>
+        <w:t>testen</w:t>
+      </w:r>
+      <w:proofErr w:type="gramEnd"/>
+      <w:r>
+        <w:rPr>
+          <w:rFonts w:asciiTheme="minorHAnsi" w:hAnsiTheme="minorHAnsi" w:cstheme="minorHAnsi"/>
+        </w:rPr>
+        <w:t xml:space="preserve"> werden Testdaten verwendet. Auch für diese Testdaten (wie für die Trainingsdaten) ist die Beschriftung, also tatsächliche Klasse der Daten, bekannt. Bei unseren Äffchen wissen wir also, ob sie beißen oder nicht. Um zu bewerten, wie „gut“ das Modell die Testdaten klassifiziert, wird die Güte des Modells bestimmt. Dazu wird das Modell auf die Testdaten angewendet. Anschließend vergleiche wir die vom Modell vorhergesagten mit den eigentlichen Beschriftungen.</w:t>
       </w:r>
     </w:p>
     <w:p>
@@ -5376,7 +5659,7 @@
                     <pic:cNvPicPr/>
                   </pic:nvPicPr>
                   <pic:blipFill>
-                    <a:blip r:embed="rId18"/>
+                    <a:blip r:embed="rId22"/>
                     <a:stretch/>
                   </pic:blipFill>
                   <pic:spPr bwMode="auto">
@@ -5929,7 +6212,7 @@
                     <pic:cNvPicPr/>
                   </pic:nvPicPr>
                   <pic:blipFill rotWithShape="1">
-                    <a:blip r:embed="rId19">
+                    <a:blip r:embed="rId23">
                       <a:extLst>
                         <a:ext uri="{28A0092B-C50C-407E-A947-70E740481C1C}">
                           <a14:useLocalDpi xmlns:a14="http://schemas.microsoft.com/office/drawing/2010/main" val="0"/>
@@ -6130,7 +6413,7 @@
                     <pic:cNvPicPr/>
                   </pic:nvPicPr>
                   <pic:blipFill rotWithShape="1">
-                    <a:blip r:embed="rId19">
+                    <a:blip r:embed="rId23">
                       <a:extLst>
                         <a:ext uri="{28A0092B-C50C-407E-A947-70E740481C1C}">
                           <a14:useLocalDpi xmlns:a14="http://schemas.microsoft.com/office/drawing/2010/main" val="0"/>
@@ -6312,7 +6595,7 @@
                     <pic:cNvPicPr/>
                   </pic:nvPicPr>
                   <pic:blipFill rotWithShape="1">
-                    <a:blip r:embed="rId19">
+                    <a:blip r:embed="rId23">
                       <a:extLst>
                         <a:ext uri="{28A0092B-C50C-407E-A947-70E740481C1C}">
                           <a14:useLocalDpi xmlns:a14="http://schemas.microsoft.com/office/drawing/2010/main" val="0"/>
@@ -6506,11 +6789,11 @@
           <w:bCs/>
         </w:rPr>
       </w:pPr>
-      <w:bookmarkStart w:id="28" w:name="_3dy6vkm"/>
-      <w:bookmarkStart w:id="29" w:name="_Toc83890421"/>
-      <w:bookmarkStart w:id="30" w:name="_Toc83890663"/>
-      <w:bookmarkStart w:id="31" w:name="_Toc90635439"/>
-      <w:bookmarkEnd w:id="28"/>
+      <w:bookmarkStart w:id="46" w:name="_3dy6vkm"/>
+      <w:bookmarkStart w:id="47" w:name="_Toc83890421"/>
+      <w:bookmarkStart w:id="48" w:name="_Toc83890663"/>
+      <w:bookmarkStart w:id="49" w:name="_Toc90635439"/>
+      <w:bookmarkEnd w:id="46"/>
       <w:r>
         <w:rPr>
           <w:rFonts w:asciiTheme="minorHAnsi" w:hAnsiTheme="minorHAnsi" w:cstheme="minorHAnsi"/>
@@ -6518,9 +6801,9 @@
         </w:rPr>
         <w:t>Bias</w:t>
       </w:r>
-      <w:bookmarkEnd w:id="29"/>
-      <w:bookmarkEnd w:id="30"/>
-      <w:bookmarkEnd w:id="31"/>
+      <w:bookmarkEnd w:id="47"/>
+      <w:bookmarkEnd w:id="48"/>
+      <w:bookmarkEnd w:id="49"/>
     </w:p>
     <w:p>
       <w:pPr>
@@ -6614,9 +6897,15 @@
     <w:p>
       <w:pPr>
         <w:widowControl w:val="0"/>
-        <w:rPr>
-          <w:rFonts w:asciiTheme="minorHAnsi" w:hAnsiTheme="minorHAnsi" w:cstheme="minorHAnsi"/>
-        </w:rPr>
+        <w:jc w:val="both"/>
+        <w:rPr>
+          <w:rFonts w:asciiTheme="minorHAnsi" w:hAnsiTheme="minorHAnsi" w:cstheme="minorHAnsi"/>
+        </w:rPr>
+        <w:pPrChange w:id="50" w:author="Imke Endjer" w:date="2023-02-22T11:22:00Z">
+          <w:pPr>
+            <w:widowControl w:val="0"/>
+          </w:pPr>
+        </w:pPrChange>
       </w:pPr>
       <w:r>
         <w:rPr>
@@ -6654,22 +6943,28 @@
     <w:p>
       <w:pPr>
         <w:widowControl w:val="0"/>
-        <w:rPr>
-          <w:rFonts w:asciiTheme="minorHAnsi" w:hAnsiTheme="minorHAnsi" w:cstheme="minorHAnsi"/>
-        </w:rPr>
-      </w:pPr>
-      <w:r>
-        <w:rPr>
-          <w:rFonts w:asciiTheme="minorHAnsi" w:hAnsiTheme="minorHAnsi" w:cstheme="minorHAnsi"/>
-        </w:rPr>
-        <w:t xml:space="preserve">Ein KI-System an sich ist also nicht „diskriminierend“ oder „sexistisch“. Aber wir Menschen sind eben oftmals unfair oder voreingenommen und das zeigt sich auch in den von uns produzierten Daten, die wir für maschinelle Lernverfahren heranziehen (etwa bei Bewerbungsprozessen). Damit übertragen wir unsere menschlichen Vorurteile auf die Technologie. Ein Bias kann aber auch durch Fehler in der Datenerhebung der verwendeten Datensätze (Stichprobenauswahl, soziale Erwünschtheit, …) entstehen. Bias in den verwendeten Daten aufzudecken, ist in der Praxis nicht so einfach: In diesem Modul arbeiten wir zu Beginn mit sehr kleinen Datensätzen, die wir auch händisch auswerten und überblicken können. In der Praxis hingegen, werden </w:t>
+        <w:jc w:val="both"/>
+        <w:rPr>
+          <w:rFonts w:asciiTheme="minorHAnsi" w:hAnsiTheme="minorHAnsi" w:cstheme="minorHAnsi"/>
+        </w:rPr>
+        <w:pPrChange w:id="51" w:author="Imke Endjer" w:date="2023-02-22T11:22:00Z">
+          <w:pPr>
+            <w:widowControl w:val="0"/>
+          </w:pPr>
+        </w:pPrChange>
+      </w:pPr>
+      <w:r>
+        <w:rPr>
+          <w:rFonts w:asciiTheme="minorHAnsi" w:hAnsiTheme="minorHAnsi" w:cstheme="minorHAnsi"/>
+        </w:rPr>
+        <w:t xml:space="preserve">Ein KI-System an sich ist also nicht „diskriminierend“ oder „sexistisch“. Aber wir Menschen sind eben oftmals unfair oder voreingenommen und das zeigt sich auch in den von uns produzierten Daten, die wir für maschinelle Lernverfahren heranziehen (etwa bei Bewerbungsprozessen). Damit übertragen wir unsere menschlichen Vorurteile auf die Technologie. Ein Bias kann aber auch durch Fehler in der Datenerhebung der verwendeten Datensätze (Stichprobenauswahl, soziale Erwünschtheit, …) entstehen. Bias in den verwendeten Daten aufzudecken, ist in der Praxis nicht so einfach: In diesem Modul arbeiten wir zu Beginn mit sehr kleinen Datensätzen, die wir auch händisch auswerten und überblicken können. In der Praxis hingegen, werden große </w:t>
       </w:r>
       <w:r>
         <w:rPr>
           <w:rFonts w:asciiTheme="minorHAnsi" w:hAnsiTheme="minorHAnsi" w:cstheme="minorHAnsi"/>
         </w:rPr>
         <w:lastRenderedPageBreak/>
-        <w:t>große Datensätze mit Millionen von Datenpunkten verwendet. Wie immer, wenn Informatiksysteme Entscheidungen mit direktem Einfluss auf unser Leben fällen, müssen sie insbesondere auch im Praxiseinsatz gründlich überprüft werden, um sicherzustellen, dass sie auch wie beabsichtigt funktioniert</w:t>
+        <w:t>Datensätze mit Millionen von Datenpunkten verwendet. Wie immer, wenn Informatiksysteme Entscheidungen mit direktem Einfluss auf unser Leben fällen, müssen sie insbesondere auch im Praxiseinsatz gründlich überprüft werden, um sicherzustellen, dass sie auch wie beabsichtigt funktioniert</w:t>
       </w:r>
       <w:r>
         <w:rPr>
@@ -6698,11 +6993,11 @@
           <w:bCs/>
         </w:rPr>
       </w:pPr>
-      <w:bookmarkStart w:id="32" w:name="_noyvwh1bfpyx"/>
-      <w:bookmarkStart w:id="33" w:name="_Toc83890422"/>
-      <w:bookmarkStart w:id="34" w:name="_Toc83890664"/>
-      <w:bookmarkStart w:id="35" w:name="_Toc90635440"/>
-      <w:bookmarkEnd w:id="32"/>
+      <w:bookmarkStart w:id="52" w:name="_noyvwh1bfpyx"/>
+      <w:bookmarkStart w:id="53" w:name="_Toc83890422"/>
+      <w:bookmarkStart w:id="54" w:name="_Toc83890664"/>
+      <w:bookmarkStart w:id="55" w:name="_Toc90635440"/>
+      <w:bookmarkEnd w:id="52"/>
       <w:r>
         <w:rPr>
           <w:rFonts w:asciiTheme="minorHAnsi" w:hAnsiTheme="minorHAnsi" w:cstheme="minorHAnsi"/>
@@ -6710,9 +7005,9 @@
         </w:rPr>
         <w:t>Orange3</w:t>
       </w:r>
-      <w:bookmarkEnd w:id="33"/>
-      <w:bookmarkEnd w:id="34"/>
-      <w:bookmarkEnd w:id="35"/>
+      <w:bookmarkEnd w:id="53"/>
+      <w:bookmarkEnd w:id="54"/>
+      <w:bookmarkEnd w:id="55"/>
     </w:p>
     <w:p>
       <w:pPr>
@@ -6742,7 +7037,7 @@
         </w:rPr>
         <w:t>Orange3 ist ein Datenanalysetool, das an der Universität Ljubljana entwickelt wird und für alle gängigen Desktop-Betriebssysteme zum Download zur Verfügung steht (</w:t>
       </w:r>
-      <w:hyperlink r:id="rId20" w:tooltip="http://orange.biolab.si/" w:history="1">
+      <w:hyperlink r:id="rId24" w:tooltip="http://orange.biolab.si/" w:history="1">
         <w:r>
           <w:rPr>
             <w:rFonts w:asciiTheme="minorHAnsi" w:hAnsiTheme="minorHAnsi" w:cstheme="minorHAnsi"/>
@@ -6987,7 +7282,7 @@
                     <pic:cNvPicPr/>
                   </pic:nvPicPr>
                   <pic:blipFill>
-                    <a:blip r:embed="rId21"/>
+                    <a:blip r:embed="rId25"/>
                     <a:stretch/>
                   </pic:blipFill>
                   <pic:spPr bwMode="auto">
@@ -7080,9 +7375,9 @@
           <w:bCs/>
         </w:rPr>
       </w:pPr>
-      <w:bookmarkStart w:id="36" w:name="_Toc83890423"/>
-      <w:bookmarkStart w:id="37" w:name="_Toc83890665"/>
-      <w:bookmarkStart w:id="38" w:name="_Toc90635441"/>
+      <w:bookmarkStart w:id="56" w:name="_Toc83890423"/>
+      <w:bookmarkStart w:id="57" w:name="_Toc83890665"/>
+      <w:bookmarkStart w:id="58" w:name="_Toc90635441"/>
       <w:r>
         <w:rPr>
           <w:rFonts w:asciiTheme="minorHAnsi" w:hAnsiTheme="minorHAnsi" w:cstheme="minorHAnsi"/>
@@ -7091,9 +7386,9 @@
         <w:lastRenderedPageBreak/>
         <w:t>Unterrichtliche Umsetzung</w:t>
       </w:r>
-      <w:bookmarkEnd w:id="36"/>
-      <w:bookmarkEnd w:id="37"/>
-      <w:bookmarkEnd w:id="38"/>
+      <w:bookmarkEnd w:id="56"/>
+      <w:bookmarkEnd w:id="57"/>
+      <w:bookmarkEnd w:id="58"/>
     </w:p>
     <w:p>
       <w:pPr>
@@ -7196,7 +7491,7 @@
                     <pic:cNvPicPr/>
                   </pic:nvPicPr>
                   <pic:blipFill>
-                    <a:blip r:embed="rId22"/>
+                    <a:blip r:embed="rId26"/>
                     <a:stretch/>
                   </pic:blipFill>
                   <pic:spPr bwMode="auto">
@@ -7277,9 +7572,9 @@
           <w:bCs/>
         </w:rPr>
       </w:pPr>
-      <w:bookmarkStart w:id="39" w:name="_Toc83890424"/>
-      <w:bookmarkStart w:id="40" w:name="_Toc83890666"/>
-      <w:bookmarkStart w:id="41" w:name="_Toc90635442"/>
+      <w:bookmarkStart w:id="59" w:name="_Toc83890424"/>
+      <w:bookmarkStart w:id="60" w:name="_Toc83890666"/>
+      <w:bookmarkStart w:id="61" w:name="_Toc90635442"/>
       <w:r>
         <w:rPr>
           <w:rFonts w:asciiTheme="minorHAnsi" w:hAnsiTheme="minorHAnsi" w:cstheme="minorHAnsi"/>
@@ -7288,9 +7583,9 @@
         <w:lastRenderedPageBreak/>
         <w:t>Grober Unterrichtsplan</w:t>
       </w:r>
-      <w:bookmarkEnd w:id="39"/>
-      <w:bookmarkEnd w:id="40"/>
-      <w:bookmarkEnd w:id="41"/>
+      <w:bookmarkEnd w:id="59"/>
+      <w:bookmarkEnd w:id="60"/>
+      <w:bookmarkEnd w:id="61"/>
     </w:p>
     <w:p>
       <w:pPr>
@@ -8130,9 +8425,9 @@
           <w:rFonts w:asciiTheme="minorHAnsi" w:hAnsiTheme="minorHAnsi" w:cstheme="minorHAnsi"/>
         </w:rPr>
         <w:sectPr>
-          <w:footerReference w:type="default" r:id="rId23"/>
-          <w:headerReference w:type="first" r:id="rId24"/>
-          <w:footerReference w:type="first" r:id="rId25"/>
+          <w:footerReference w:type="default" r:id="rId27"/>
+          <w:headerReference w:type="first" r:id="rId28"/>
+          <w:footerReference w:type="first" r:id="rId29"/>
           <w:pgSz w:w="11906" w:h="16838"/>
           <w:pgMar w:top="1134" w:right="1531" w:bottom="1134" w:left="1531" w:header="284" w:footer="329" w:gutter="0"/>
           <w:cols w:space="708"/>
@@ -8156,9 +8451,9 @@
           <w:bCs/>
         </w:rPr>
       </w:pPr>
-      <w:bookmarkStart w:id="46" w:name="_Toc83890425"/>
-      <w:bookmarkStart w:id="47" w:name="_Toc83890667"/>
-      <w:bookmarkStart w:id="48" w:name="_Toc90635443"/>
+      <w:bookmarkStart w:id="66" w:name="_Toc83890425"/>
+      <w:bookmarkStart w:id="67" w:name="_Toc83890667"/>
+      <w:bookmarkStart w:id="68" w:name="_Toc90635443"/>
       <w:r>
         <w:rPr>
           <w:rFonts w:asciiTheme="minorHAnsi" w:hAnsiTheme="minorHAnsi" w:cstheme="minorHAnsi"/>
@@ -8167,9 +8462,9 @@
         <w:lastRenderedPageBreak/>
         <w:t>Stundenverlaufsskizzen</w:t>
       </w:r>
-      <w:bookmarkEnd w:id="46"/>
-      <w:bookmarkEnd w:id="47"/>
-      <w:bookmarkEnd w:id="48"/>
+      <w:bookmarkEnd w:id="66"/>
+      <w:bookmarkEnd w:id="67"/>
+      <w:bookmarkEnd w:id="68"/>
     </w:p>
     <w:p>
       <w:pPr>
@@ -8245,9 +8540,9 @@
           <w:b/>
         </w:rPr>
       </w:pPr>
-      <w:bookmarkStart w:id="49" w:name="_Toc83890426"/>
-      <w:bookmarkStart w:id="50" w:name="_Toc83890668"/>
-      <w:bookmarkStart w:id="51" w:name="_Toc90635444"/>
+      <w:bookmarkStart w:id="69" w:name="_Toc83890426"/>
+      <w:bookmarkStart w:id="70" w:name="_Toc83890668"/>
+      <w:bookmarkStart w:id="71" w:name="_Toc90635444"/>
       <w:r>
         <w:rPr>
           <w:rFonts w:asciiTheme="minorHAnsi" w:hAnsiTheme="minorHAnsi" w:cstheme="minorHAnsi"/>
@@ -8255,9 +8550,9 @@
         </w:rPr>
         <w:t>Stunde 1: Datenanalyse und Entscheidungsbaum</w:t>
       </w:r>
-      <w:bookmarkEnd w:id="49"/>
-      <w:bookmarkEnd w:id="50"/>
-      <w:bookmarkEnd w:id="51"/>
+      <w:bookmarkEnd w:id="69"/>
+      <w:bookmarkEnd w:id="70"/>
+      <w:bookmarkEnd w:id="71"/>
     </w:p>
     <w:p>
       <w:pPr>
@@ -9025,10 +9320,10 @@
           <w:rFonts w:asciiTheme="minorHAnsi" w:hAnsiTheme="minorHAnsi" w:cstheme="minorHAnsi"/>
         </w:rPr>
         <w:sectPr>
-          <w:headerReference w:type="default" r:id="rId26"/>
-          <w:footerReference w:type="default" r:id="rId27"/>
-          <w:headerReference w:type="first" r:id="rId28"/>
-          <w:footerReference w:type="first" r:id="rId29"/>
+          <w:headerReference w:type="default" r:id="rId30"/>
+          <w:footerReference w:type="default" r:id="rId31"/>
+          <w:headerReference w:type="first" r:id="rId32"/>
+          <w:footerReference w:type="first" r:id="rId33"/>
           <w:pgSz w:w="16838" w:h="11906" w:orient="landscape"/>
           <w:pgMar w:top="1531" w:right="1134" w:bottom="1134" w:left="1134" w:header="709" w:footer="346" w:gutter="0"/>
           <w:cols w:space="708"/>
@@ -9340,14 +9635,14 @@
         </w:rPr>
         <w:t xml:space="preserve"> herangezogen. Bei der Erstellung der Regeln bzw. des Entscheidungsbaums auf dem zugehörigen Arbeitsblatt gibt es keine „eine Musterlösung“, auch wenn in den Begleitmaterialen eine mögliche „gute“ Lösung zur Orientierung angegeben ist. Auch diese Lösung ermöglicht aber keine vollständig korrekte Klassifikation der Testdaten, die beim maschinellen Lernen im Allgemeinen nicht erreicht werden kann. Die Schülerinnen und Schüler sollen bewusst mit ihren eigenen </w:t>
       </w:r>
-      <w:bookmarkStart w:id="52" w:name="_Hlk77938078"/>
+      <w:bookmarkStart w:id="72" w:name="_Hlk77938078"/>
       <w:r>
         <w:rPr>
           <w:rFonts w:asciiTheme="minorHAnsi" w:hAnsiTheme="minorHAnsi" w:cstheme="minorHAnsi"/>
         </w:rPr>
         <w:t>–</w:t>
       </w:r>
-      <w:bookmarkEnd w:id="52"/>
+      <w:bookmarkEnd w:id="72"/>
       <w:r>
         <w:rPr>
           <w:rFonts w:asciiTheme="minorHAnsi" w:hAnsiTheme="minorHAnsi" w:cstheme="minorHAnsi"/>
@@ -9422,9 +9717,9 @@
           <w:rFonts w:asciiTheme="minorHAnsi" w:hAnsiTheme="minorHAnsi" w:cstheme="minorHAnsi"/>
         </w:rPr>
         <w:sectPr>
-          <w:footerReference w:type="default" r:id="rId30"/>
-          <w:headerReference w:type="first" r:id="rId31"/>
-          <w:footerReference w:type="first" r:id="rId32"/>
+          <w:footerReference w:type="default" r:id="rId34"/>
+          <w:headerReference w:type="first" r:id="rId35"/>
+          <w:footerReference w:type="first" r:id="rId36"/>
           <w:pgSz w:w="11906" w:h="16838"/>
           <w:pgMar w:top="1134" w:right="1531" w:bottom="1134" w:left="1531" w:header="284" w:footer="329" w:gutter="0"/>
           <w:cols w:space="708"/>
@@ -9446,9 +9741,9 @@
           <w:b/>
         </w:rPr>
       </w:pPr>
-      <w:bookmarkStart w:id="53" w:name="_Toc83890427"/>
-      <w:bookmarkStart w:id="54" w:name="_Toc83890669"/>
-      <w:bookmarkStart w:id="55" w:name="_Toc90635445"/>
+      <w:bookmarkStart w:id="73" w:name="_Toc83890427"/>
+      <w:bookmarkStart w:id="74" w:name="_Toc83890669"/>
+      <w:bookmarkStart w:id="75" w:name="_Toc90635445"/>
       <w:r>
         <w:rPr>
           <w:rFonts w:asciiTheme="minorHAnsi" w:hAnsiTheme="minorHAnsi" w:cstheme="minorHAnsi"/>
@@ -9457,9 +9752,9 @@
         <w:lastRenderedPageBreak/>
         <w:t>Stunde 2-3: Datenanalyse mit Orange3</w:t>
       </w:r>
-      <w:bookmarkEnd w:id="53"/>
-      <w:bookmarkEnd w:id="54"/>
-      <w:bookmarkEnd w:id="55"/>
+      <w:bookmarkEnd w:id="73"/>
+      <w:bookmarkEnd w:id="74"/>
+      <w:bookmarkEnd w:id="75"/>
     </w:p>
     <w:p>
       <w:pPr>
@@ -10138,10 +10433,10 @@
           <w:rFonts w:asciiTheme="minorHAnsi" w:hAnsiTheme="minorHAnsi" w:cstheme="minorHAnsi"/>
         </w:rPr>
         <w:sectPr>
-          <w:headerReference w:type="default" r:id="rId33"/>
-          <w:footerReference w:type="default" r:id="rId34"/>
-          <w:headerReference w:type="first" r:id="rId35"/>
-          <w:footerReference w:type="first" r:id="rId36"/>
+          <w:headerReference w:type="default" r:id="rId37"/>
+          <w:footerReference w:type="default" r:id="rId38"/>
+          <w:headerReference w:type="first" r:id="rId39"/>
+          <w:footerReference w:type="first" r:id="rId40"/>
           <w:pgSz w:w="16838" w:h="11906" w:orient="landscape"/>
           <w:pgMar w:top="1531" w:right="1134" w:bottom="1134" w:left="1134" w:header="709" w:footer="346" w:gutter="0"/>
           <w:cols w:space="708"/>
@@ -10293,7 +10588,7 @@
                     <pic:cNvPicPr/>
                   </pic:nvPicPr>
                   <pic:blipFill>
-                    <a:blip r:embed="rId37"/>
+                    <a:blip r:embed="rId41"/>
                     <a:stretch/>
                   </pic:blipFill>
                   <pic:spPr bwMode="auto">
@@ -10350,7 +10645,7 @@
                     <pic:cNvPicPr/>
                   </pic:nvPicPr>
                   <pic:blipFill>
-                    <a:blip r:embed="rId38"/>
+                    <a:blip r:embed="rId42"/>
                     <a:stretch/>
                   </pic:blipFill>
                   <pic:spPr bwMode="auto">
@@ -10634,9 +10929,9 @@
           <w:rFonts w:asciiTheme="minorHAnsi" w:hAnsiTheme="minorHAnsi" w:cstheme="minorHAnsi"/>
         </w:rPr>
         <w:sectPr>
-          <w:footerReference w:type="default" r:id="rId39"/>
-          <w:headerReference w:type="first" r:id="rId40"/>
-          <w:footerReference w:type="first" r:id="rId41"/>
+          <w:footerReference w:type="default" r:id="rId43"/>
+          <w:headerReference w:type="first" r:id="rId44"/>
+          <w:footerReference w:type="first" r:id="rId45"/>
           <w:pgSz w:w="11906" w:h="16838"/>
           <w:pgMar w:top="1134" w:right="1531" w:bottom="1134" w:left="1531" w:header="284" w:footer="329" w:gutter="0"/>
           <w:cols w:space="708"/>
@@ -10658,9 +10953,9 @@
           <w:b/>
         </w:rPr>
       </w:pPr>
-      <w:bookmarkStart w:id="56" w:name="_Toc83890428"/>
-      <w:bookmarkStart w:id="57" w:name="_Toc83890670"/>
-      <w:bookmarkStart w:id="58" w:name="_Toc90635446"/>
+      <w:bookmarkStart w:id="76" w:name="_Toc83890428"/>
+      <w:bookmarkStart w:id="77" w:name="_Toc83890670"/>
+      <w:bookmarkStart w:id="78" w:name="_Toc90635446"/>
       <w:r>
         <w:rPr>
           <w:rFonts w:asciiTheme="minorHAnsi" w:hAnsiTheme="minorHAnsi" w:cstheme="minorHAnsi"/>
@@ -10669,9 +10964,9 @@
         <w:lastRenderedPageBreak/>
         <w:t>Stunde 4-6: Projektarbeit (nur Variante II)</w:t>
       </w:r>
-      <w:bookmarkEnd w:id="56"/>
-      <w:bookmarkEnd w:id="57"/>
-      <w:bookmarkEnd w:id="58"/>
+      <w:bookmarkEnd w:id="76"/>
+      <w:bookmarkEnd w:id="77"/>
+      <w:bookmarkEnd w:id="78"/>
     </w:p>
     <w:p>
       <w:pPr>
@@ -11067,7 +11362,23 @@
                 <w:rFonts w:asciiTheme="minorHAnsi" w:hAnsiTheme="minorHAnsi" w:cstheme="minorHAnsi"/>
                 <w:color w:val="auto"/>
               </w:rPr>
-              <w:t>Die Schülerinnen und Schüler bearbeiten das gewählte Projektthema in Gruppen und halten ihre Ergebnisse auf einem Plakat fest. Optional kann während des Projekts den Gruppen der Link zu einem Interview mit Data Scientist gegeben werden</w:t>
+              <w:t xml:space="preserve">Die Schülerinnen und Schüler bearbeiten das gewählte Projektthema </w:t>
+            </w:r>
+            <w:proofErr w:type="gramStart"/>
+            <w:r>
+              <w:rPr>
+                <w:rFonts w:asciiTheme="minorHAnsi" w:hAnsiTheme="minorHAnsi" w:cstheme="minorHAnsi"/>
+                <w:color w:val="auto"/>
+              </w:rPr>
+              <w:t>in Gruppen und halten</w:t>
+            </w:r>
+            <w:proofErr w:type="gramEnd"/>
+            <w:r>
+              <w:rPr>
+                <w:rFonts w:asciiTheme="minorHAnsi" w:hAnsiTheme="minorHAnsi" w:cstheme="minorHAnsi"/>
+                <w:color w:val="auto"/>
+              </w:rPr>
+              <w:t xml:space="preserve"> ihre Ergebnisse auf einem Plakat fest. Optional kann während des Projekts den Gruppen der Link zu einem Interview mit Data Scientist gegeben werden</w:t>
             </w:r>
             <w:r>
               <w:rPr>
@@ -11131,7 +11442,7 @@
               </w:rPr>
               <w:t xml:space="preserve">Interview mit Elena Bruna </w:t>
             </w:r>
-            <w:hyperlink r:id="rId42" w:history="1">
+            <w:hyperlink r:id="rId46" w:history="1">
               <w:r>
                 <w:rPr>
                   <w:rStyle w:val="Hyperlink"/>
@@ -11219,7 +11530,7 @@
               </w:rPr>
               <w:t xml:space="preserve"> </w:t>
             </w:r>
-            <w:hyperlink r:id="rId43" w:history="1">
+            <w:hyperlink r:id="rId47" w:history="1">
               <w:r>
                 <w:rPr>
                   <w:rStyle w:val="Hyperlink"/>
@@ -11474,10 +11785,10 @@
           <w:rFonts w:asciiTheme="minorHAnsi" w:hAnsiTheme="minorHAnsi" w:cstheme="minorHAnsi"/>
         </w:rPr>
         <w:sectPr>
-          <w:headerReference w:type="default" r:id="rId44"/>
-          <w:footerReference w:type="default" r:id="rId45"/>
-          <w:headerReference w:type="first" r:id="rId46"/>
-          <w:footerReference w:type="first" r:id="rId47"/>
+          <w:headerReference w:type="default" r:id="rId48"/>
+          <w:footerReference w:type="default" r:id="rId49"/>
+          <w:headerReference w:type="first" r:id="rId50"/>
+          <w:footerReference w:type="first" r:id="rId51"/>
           <w:pgSz w:w="16838" w:h="11906" w:orient="landscape"/>
           <w:pgMar w:top="1531" w:right="1134" w:bottom="1134" w:left="1134" w:header="709" w:footer="346" w:gutter="0"/>
           <w:cols w:space="708"/>
@@ -11947,9 +12258,9 @@
           <w:rFonts w:asciiTheme="minorHAnsi" w:hAnsiTheme="minorHAnsi" w:cstheme="minorHAnsi"/>
         </w:rPr>
         <w:sectPr>
-          <w:footerReference w:type="default" r:id="rId48"/>
-          <w:headerReference w:type="first" r:id="rId49"/>
-          <w:footerReference w:type="first" r:id="rId50"/>
+          <w:footerReference w:type="default" r:id="rId52"/>
+          <w:headerReference w:type="first" r:id="rId53"/>
+          <w:footerReference w:type="first" r:id="rId54"/>
           <w:pgSz w:w="11906" w:h="16838"/>
           <w:pgMar w:top="1134" w:right="1531" w:bottom="1134" w:left="1531" w:header="284" w:footer="329" w:gutter="0"/>
           <w:cols w:space="708"/>
@@ -11972,9 +12283,9 @@
           <w:b/>
         </w:rPr>
       </w:pPr>
-      <w:bookmarkStart w:id="59" w:name="_Toc83890429"/>
-      <w:bookmarkStart w:id="60" w:name="_Toc83890671"/>
-      <w:bookmarkStart w:id="61" w:name="_Toc90635447"/>
+      <w:bookmarkStart w:id="79" w:name="_Toc83890429"/>
+      <w:bookmarkStart w:id="80" w:name="_Toc83890671"/>
+      <w:bookmarkStart w:id="81" w:name="_Toc90635447"/>
       <w:r>
         <w:rPr>
           <w:rFonts w:asciiTheme="minorHAnsi" w:hAnsiTheme="minorHAnsi" w:cstheme="minorHAnsi"/>
@@ -11983,9 +12294,9 @@
         <w:lastRenderedPageBreak/>
         <w:t>Stunde 7: KI und unsere Gesellschaft</w:t>
       </w:r>
-      <w:bookmarkEnd w:id="59"/>
-      <w:bookmarkEnd w:id="60"/>
-      <w:bookmarkEnd w:id="61"/>
+      <w:bookmarkEnd w:id="79"/>
+      <w:bookmarkEnd w:id="80"/>
+      <w:bookmarkEnd w:id="81"/>
     </w:p>
     <w:p>
       <w:pPr>
@@ -12994,10 +13305,10 @@
           <w:rFonts w:asciiTheme="minorHAnsi" w:hAnsiTheme="minorHAnsi" w:cstheme="minorHAnsi"/>
         </w:rPr>
         <w:sectPr>
-          <w:headerReference w:type="default" r:id="rId51"/>
-          <w:footerReference w:type="default" r:id="rId52"/>
-          <w:headerReference w:type="first" r:id="rId53"/>
-          <w:footerReference w:type="first" r:id="rId54"/>
+          <w:headerReference w:type="default" r:id="rId55"/>
+          <w:footerReference w:type="default" r:id="rId56"/>
+          <w:headerReference w:type="first" r:id="rId57"/>
+          <w:footerReference w:type="first" r:id="rId58"/>
           <w:pgSz w:w="16838" w:h="11906" w:orient="landscape"/>
           <w:pgMar w:top="1531" w:right="1134" w:bottom="1134" w:left="1134" w:header="709" w:footer="346" w:gutter="0"/>
           <w:cols w:space="708"/>
@@ -13085,7 +13396,7 @@
           <w:bCs/>
         </w:rPr>
       </w:pPr>
-      <w:bookmarkStart w:id="62" w:name="_Toc90635448"/>
+      <w:bookmarkStart w:id="82" w:name="_Toc90635448"/>
       <w:r>
         <w:rPr>
           <w:rFonts w:asciiTheme="minorHAnsi" w:hAnsiTheme="minorHAnsi" w:cstheme="minorHAnsi"/>
@@ -13093,7 +13404,7 @@
         </w:rPr>
         <w:t>Einbettung in verschiedene Fächer und Themen</w:t>
       </w:r>
-      <w:bookmarkEnd w:id="62"/>
+      <w:bookmarkEnd w:id="82"/>
     </w:p>
     <w:p>
       <w:pPr>
@@ -13122,9 +13433,9 @@
           <w:bCs/>
         </w:rPr>
       </w:pPr>
-      <w:bookmarkStart w:id="63" w:name="_Toc83890430"/>
-      <w:bookmarkStart w:id="64" w:name="_Toc83890672"/>
-      <w:bookmarkStart w:id="65" w:name="_Toc90635449"/>
+      <w:bookmarkStart w:id="83" w:name="_Toc83890430"/>
+      <w:bookmarkStart w:id="84" w:name="_Toc83890672"/>
+      <w:bookmarkStart w:id="85" w:name="_Toc90635449"/>
       <w:r>
         <w:rPr>
           <w:rFonts w:asciiTheme="minorHAnsi" w:hAnsiTheme="minorHAnsi" w:cstheme="minorHAnsi"/>
@@ -13132,9 +13443,9 @@
         </w:rPr>
         <w:t>Anschlussthemen</w:t>
       </w:r>
-      <w:bookmarkEnd w:id="63"/>
-      <w:bookmarkEnd w:id="64"/>
-      <w:bookmarkEnd w:id="65"/>
+      <w:bookmarkEnd w:id="83"/>
+      <w:bookmarkEnd w:id="84"/>
+      <w:bookmarkEnd w:id="85"/>
     </w:p>
     <w:p>
       <w:pPr>
@@ -13217,7 +13528,7 @@
                     <pic:cNvPicPr/>
                   </pic:nvPicPr>
                   <pic:blipFill>
-                    <a:blip r:embed="rId55" cstate="print">
+                    <a:blip r:embed="rId59" cstate="print">
                       <a:extLst>
                         <a:ext uri="{28A0092B-C50C-407E-A947-70E740481C1C}">
                           <a14:useLocalDpi xmlns:a14="http://schemas.microsoft.com/office/drawing/2010/main" val="0"/>
@@ -13271,9 +13582,9 @@
           <w:bCs/>
         </w:rPr>
       </w:pPr>
-      <w:bookmarkStart w:id="66" w:name="_Toc83890431"/>
-      <w:bookmarkStart w:id="67" w:name="_Toc83890673"/>
-      <w:bookmarkStart w:id="68" w:name="_Toc90635450"/>
+      <w:bookmarkStart w:id="86" w:name="_Toc83890431"/>
+      <w:bookmarkStart w:id="87" w:name="_Toc83890673"/>
+      <w:bookmarkStart w:id="88" w:name="_Toc90635450"/>
       <w:r>
         <w:rPr>
           <w:rFonts w:asciiTheme="minorHAnsi" w:hAnsiTheme="minorHAnsi" w:cstheme="minorHAnsi"/>
@@ -13282,9 +13593,9 @@
         <w:lastRenderedPageBreak/>
         <w:t>Literatur und Links</w:t>
       </w:r>
-      <w:bookmarkEnd w:id="66"/>
-      <w:bookmarkEnd w:id="67"/>
-      <w:bookmarkEnd w:id="68"/>
+      <w:bookmarkEnd w:id="86"/>
+      <w:bookmarkEnd w:id="87"/>
+      <w:bookmarkEnd w:id="88"/>
       <w:r>
         <w:rPr>
           <w:rFonts w:asciiTheme="minorHAnsi" w:hAnsiTheme="minorHAnsi" w:cstheme="minorHAnsi"/>
@@ -13326,7 +13637,7 @@
         </w:rPr>
         <w:t xml:space="preserve">: </w:t>
       </w:r>
-      <w:hyperlink r:id="rId56" w:history="1">
+      <w:hyperlink r:id="rId60" w:history="1">
         <w:r>
           <w:rPr>
             <w:rStyle w:val="Hyperlink"/>
@@ -13376,7 +13687,7 @@
         </w:rPr>
         <w:t xml:space="preserve">: </w:t>
       </w:r>
-      <w:hyperlink r:id="rId57" w:history="1">
+      <w:hyperlink r:id="rId61" w:history="1">
         <w:r>
           <w:rPr>
             <w:rStyle w:val="Hyperlink"/>
@@ -13433,7 +13744,7 @@
         </w:rPr>
         <w:t xml:space="preserve"> </w:t>
       </w:r>
-      <w:hyperlink r:id="rId58" w:history="1">
+      <w:hyperlink r:id="rId62" w:history="1">
         <w:r>
           <w:rPr>
             <w:rStyle w:val="Hyperlink"/>
@@ -13449,7 +13760,7 @@
         </w:rPr>
         <w:t xml:space="preserve">, </w:t>
       </w:r>
-      <w:hyperlink r:id="rId59" w:history="1">
+      <w:hyperlink r:id="rId63" w:history="1">
         <w:r>
           <w:rPr>
             <w:rStyle w:val="Hyperlink"/>
@@ -13486,7 +13797,7 @@
           <w:color w:val="auto"/>
         </w:rPr>
       </w:pPr>
-      <w:bookmarkStart w:id="69" w:name="_Hlk94879626"/>
+      <w:bookmarkStart w:id="89" w:name="_Hlk94879626"/>
       <w:r>
         <w:rPr>
           <w:rFonts w:asciiTheme="minorHAnsi" w:hAnsiTheme="minorHAnsi" w:cstheme="minorHAnsi"/>
@@ -13541,7 +13852,7 @@
         </w:rPr>
         <w:br/>
       </w:r>
-      <w:hyperlink r:id="rId60" w:history="1">
+      <w:hyperlink r:id="rId64" w:history="1">
         <w:r>
           <w:rPr>
             <w:rStyle w:val="Hyperlink"/>
@@ -13564,10 +13875,10 @@
           <w:bCs/>
         </w:rPr>
       </w:pPr>
-      <w:bookmarkStart w:id="70" w:name="_Toc83890432"/>
-      <w:bookmarkStart w:id="71" w:name="_Toc83890674"/>
-      <w:bookmarkStart w:id="72" w:name="_Toc90635451"/>
-      <w:bookmarkEnd w:id="69"/>
+      <w:bookmarkStart w:id="90" w:name="_Toc83890432"/>
+      <w:bookmarkStart w:id="91" w:name="_Toc83890674"/>
+      <w:bookmarkStart w:id="92" w:name="_Toc90635451"/>
+      <w:bookmarkEnd w:id="89"/>
       <w:r>
         <w:rPr>
           <w:rFonts w:asciiTheme="minorHAnsi" w:hAnsiTheme="minorHAnsi" w:cstheme="minorHAnsi"/>
@@ -13575,9 +13886,9 @@
         </w:rPr>
         <w:t>Arbeitsmaterialien</w:t>
       </w:r>
-      <w:bookmarkEnd w:id="70"/>
-      <w:bookmarkEnd w:id="71"/>
-      <w:bookmarkEnd w:id="72"/>
+      <w:bookmarkEnd w:id="90"/>
+      <w:bookmarkEnd w:id="91"/>
+      <w:bookmarkEnd w:id="92"/>
     </w:p>
     <w:p>
       <w:pPr>
@@ -13589,7 +13900,21 @@
         <w:rPr>
           <w:rFonts w:asciiTheme="minorHAnsi" w:hAnsiTheme="minorHAnsi" w:cstheme="minorHAnsi"/>
         </w:rPr>
-        <w:t xml:space="preserve">Das Modul besteht aus folgenden Materialien. Zu allen Arbeitsblättern gibt es auch Musterlösungen. </w:t>
+        <w:t xml:space="preserve">Das Modul besteht </w:t>
+      </w:r>
+      <w:proofErr w:type="gramStart"/>
+      <w:r>
+        <w:rPr>
+          <w:rFonts w:asciiTheme="minorHAnsi" w:hAnsiTheme="minorHAnsi" w:cstheme="minorHAnsi"/>
+        </w:rPr>
+        <w:t>aus folgenden</w:t>
+      </w:r>
+      <w:proofErr w:type="gramEnd"/>
+      <w:r>
+        <w:rPr>
+          <w:rFonts w:asciiTheme="minorHAnsi" w:hAnsiTheme="minorHAnsi" w:cstheme="minorHAnsi"/>
+        </w:rPr>
+        <w:t xml:space="preserve"> Materialien. Zu allen Arbeitsblättern gibt es auch Musterlösungen. </w:t>
       </w:r>
     </w:p>
     <w:tbl>
@@ -14633,16 +14958,37 @@
               </w:rPr>
               <w:t xml:space="preserve">Interview 1: </w:t>
             </w:r>
-            <w:hyperlink r:id="rId61" w:history="1">
-              <w:r>
-                <w:rPr>
-                  <w:rStyle w:val="Hyperlink"/>
-                  <w:rFonts w:asciiTheme="minorHAnsi" w:hAnsiTheme="minorHAnsi" w:cstheme="minorHAnsi"/>
-                  <w:lang w:val="en-GB"/>
-                </w:rPr>
-                <w:t>https://youtu.be/EbURtR4NUj4</w:t>
-              </w:r>
-            </w:hyperlink>
+            <w:r>
+              <w:fldChar w:fldCharType="begin"/>
+            </w:r>
+            <w:r>
+              <w:rPr>
+                <w:lang w:val="en-GB"/>
+                <w:rPrChange w:id="93" w:author="Imke Endjer" w:date="2023-02-22T11:17:00Z">
+                  <w:rPr/>
+                </w:rPrChange>
+              </w:rPr>
+              <w:instrText>HYPERLINK "https://youtu.be/EbURtR4NUj4"</w:instrText>
+            </w:r>
+            <w:r>
+              <w:fldChar w:fldCharType="separate"/>
+            </w:r>
+            <w:r>
+              <w:rPr>
+                <w:rStyle w:val="Hyperlink"/>
+                <w:rFonts w:asciiTheme="minorHAnsi" w:hAnsiTheme="minorHAnsi" w:cstheme="minorHAnsi"/>
+                <w:lang w:val="en-GB"/>
+              </w:rPr>
+              <w:t>https://youtu.be/EbURtR4NUj4</w:t>
+            </w:r>
+            <w:r>
+              <w:rPr>
+                <w:rStyle w:val="Hyperlink"/>
+                <w:rFonts w:asciiTheme="minorHAnsi" w:hAnsiTheme="minorHAnsi" w:cstheme="minorHAnsi"/>
+                <w:lang w:val="en-GB"/>
+              </w:rPr>
+              <w:fldChar w:fldCharType="end"/>
+            </w:r>
           </w:p>
           <w:p>
             <w:pPr>
@@ -14660,16 +15006,37 @@
               </w:rPr>
               <w:t xml:space="preserve">Interview 2: </w:t>
             </w:r>
-            <w:hyperlink r:id="rId62" w:history="1">
-              <w:r>
-                <w:rPr>
-                  <w:rStyle w:val="Hyperlink"/>
-                  <w:rFonts w:asciiTheme="minorHAnsi" w:hAnsiTheme="minorHAnsi" w:cstheme="minorHAnsi"/>
-                  <w:lang w:val="en-GB"/>
-                </w:rPr>
-                <w:t>https://youtu.be/_sZnDZf7LgM</w:t>
-              </w:r>
-            </w:hyperlink>
+            <w:r>
+              <w:fldChar w:fldCharType="begin"/>
+            </w:r>
+            <w:r>
+              <w:rPr>
+                <w:lang w:val="en-GB"/>
+                <w:rPrChange w:id="94" w:author="Imke Endjer" w:date="2023-02-22T11:17:00Z">
+                  <w:rPr/>
+                </w:rPrChange>
+              </w:rPr>
+              <w:instrText>HYPERLINK "https://youtu.be/_sZnDZf7LgM"</w:instrText>
+            </w:r>
+            <w:r>
+              <w:fldChar w:fldCharType="separate"/>
+            </w:r>
+            <w:r>
+              <w:rPr>
+                <w:rStyle w:val="Hyperlink"/>
+                <w:rFonts w:asciiTheme="minorHAnsi" w:hAnsiTheme="minorHAnsi" w:cstheme="minorHAnsi"/>
+                <w:lang w:val="en-GB"/>
+              </w:rPr>
+              <w:t>https://youtu.be/_sZnDZf7LgM</w:t>
+            </w:r>
+            <w:r>
+              <w:rPr>
+                <w:rStyle w:val="Hyperlink"/>
+                <w:rFonts w:asciiTheme="minorHAnsi" w:hAnsiTheme="minorHAnsi" w:cstheme="minorHAnsi"/>
+                <w:lang w:val="en-GB"/>
+              </w:rPr>
+              <w:fldChar w:fldCharType="end"/>
+            </w:r>
           </w:p>
         </w:tc>
       </w:tr>
@@ -15012,8 +15379,8 @@
           <w:rFonts w:asciiTheme="minorHAnsi" w:hAnsiTheme="minorHAnsi" w:cstheme="minorHAnsi"/>
         </w:rPr>
       </w:pPr>
-      <w:bookmarkStart w:id="73" w:name="_2jxsxqh"/>
-      <w:bookmarkEnd w:id="73"/>
+      <w:bookmarkStart w:id="95" w:name="_2jxsxqh"/>
+      <w:bookmarkEnd w:id="95"/>
       <w:r>
         <w:rPr>
           <w:rFonts w:asciiTheme="minorHAnsi" w:eastAsia="arimo" w:hAnsiTheme="minorHAnsi" w:cstheme="minorHAnsi"/>
@@ -15088,9 +15455,9 @@
           <w:bCs/>
         </w:rPr>
       </w:pPr>
-      <w:bookmarkStart w:id="74" w:name="_Toc83890433"/>
-      <w:bookmarkStart w:id="75" w:name="_Toc83890675"/>
-      <w:bookmarkStart w:id="76" w:name="_Toc90635452"/>
+      <w:bookmarkStart w:id="96" w:name="_Toc83890433"/>
+      <w:bookmarkStart w:id="97" w:name="_Toc83890675"/>
+      <w:bookmarkStart w:id="98" w:name="_Toc90635452"/>
       <w:r>
         <w:rPr>
           <w:rFonts w:asciiTheme="minorHAnsi" w:hAnsiTheme="minorHAnsi" w:cstheme="minorHAnsi"/>
@@ -15098,9 +15465,9 @@
         </w:rPr>
         <w:t>Glossar</w:t>
       </w:r>
-      <w:bookmarkEnd w:id="74"/>
-      <w:bookmarkEnd w:id="75"/>
-      <w:bookmarkEnd w:id="76"/>
+      <w:bookmarkEnd w:id="96"/>
+      <w:bookmarkEnd w:id="97"/>
+      <w:bookmarkEnd w:id="98"/>
     </w:p>
     <w:tbl>
       <w:tblPr>
@@ -15464,12 +15831,12 @@
           <w:lang w:eastAsia="zh-CN"/>
         </w:rPr>
       </w:pPr>
-      <w:bookmarkStart w:id="77" w:name="_Toc24112811"/>
-      <w:bookmarkStart w:id="78" w:name="_Toc88152159"/>
-      <w:bookmarkStart w:id="79" w:name="_Toc90281164"/>
-      <w:bookmarkStart w:id="80" w:name="_Toc90283705"/>
-      <w:bookmarkStart w:id="81" w:name="_Toc90297969"/>
-      <w:bookmarkStart w:id="82" w:name="_Toc90635453"/>
+      <w:bookmarkStart w:id="99" w:name="_Toc24112811"/>
+      <w:bookmarkStart w:id="100" w:name="_Toc88152159"/>
+      <w:bookmarkStart w:id="101" w:name="_Toc90281164"/>
+      <w:bookmarkStart w:id="102" w:name="_Toc90283705"/>
+      <w:bookmarkStart w:id="103" w:name="_Toc90297969"/>
+      <w:bookmarkStart w:id="104" w:name="_Toc90635453"/>
     </w:p>
     <w:p>
       <w:pPr>
@@ -15516,7 +15883,7 @@
         <w:lastRenderedPageBreak/>
         <w:t>F</w:t>
       </w:r>
-      <w:bookmarkEnd w:id="77"/>
+      <w:bookmarkEnd w:id="99"/>
       <w:r>
         <w:rPr>
           <w:rFonts w:asciiTheme="minorHAnsi" w:eastAsia="helvetica neue" w:hAnsiTheme="minorHAnsi" w:cstheme="minorHAnsi"/>
@@ -15528,11 +15895,11 @@
         </w:rPr>
         <w:t>ragen, Feedback, Anregungen</w:t>
       </w:r>
-      <w:bookmarkEnd w:id="78"/>
-      <w:bookmarkEnd w:id="79"/>
-      <w:bookmarkEnd w:id="80"/>
-      <w:bookmarkEnd w:id="81"/>
-      <w:bookmarkEnd w:id="82"/>
+      <w:bookmarkEnd w:id="100"/>
+      <w:bookmarkEnd w:id="101"/>
+      <w:bookmarkEnd w:id="102"/>
+      <w:bookmarkEnd w:id="103"/>
+      <w:bookmarkEnd w:id="104"/>
     </w:p>
     <w:p>
       <w:pPr>
@@ -15591,19 +15958,19 @@
           <w:szCs w:val="21"/>
           <w:lang w:eastAsia="zh-CN"/>
         </w:rPr>
-        <w:t xml:space="preserve"> Questions) für die neuen KI-Module aufbauen oder die Module weiter entwickeln. </w:t>
-      </w:r>
-    </w:p>
-    <w:p>
-      <w:pPr>
-        <w:spacing w:before="240"/>
+        <w:t xml:space="preserve"> Questions) für die neuen KI-Module aufbauen oder die Module </w:t>
+      </w:r>
+      <w:proofErr w:type="gramStart"/>
+      <w:r>
         <w:rPr>
           <w:rFonts w:asciiTheme="minorHAnsi" w:eastAsia="helvetica neue" w:hAnsiTheme="minorHAnsi" w:cstheme="minorHAnsi"/>
           <w:bCs w:val="0"/>
           <w:szCs w:val="21"/>
           <w:lang w:eastAsia="zh-CN"/>
         </w:rPr>
-      </w:pPr>
+        <w:t>weiter entwickeln</w:t>
+      </w:r>
+      <w:proofErr w:type="gramEnd"/>
       <w:r>
         <w:rPr>
           <w:rFonts w:asciiTheme="minorHAnsi" w:eastAsia="helvetica neue" w:hAnsiTheme="minorHAnsi" w:cstheme="minorHAnsi"/>
@@ -15611,19 +15978,19 @@
           <w:szCs w:val="21"/>
           <w:lang w:eastAsia="zh-CN"/>
         </w:rPr>
-        <w:t xml:space="preserve">Bitte füllen Sie folgende Umfrage über </w:t>
-      </w:r>
-      <w:proofErr w:type="spellStart"/>
-      <w:r>
+        <w:t xml:space="preserve">. </w:t>
+      </w:r>
+    </w:p>
+    <w:p>
+      <w:pPr>
+        <w:spacing w:before="240"/>
         <w:rPr>
           <w:rFonts w:asciiTheme="minorHAnsi" w:eastAsia="helvetica neue" w:hAnsiTheme="minorHAnsi" w:cstheme="minorHAnsi"/>
           <w:bCs w:val="0"/>
           <w:szCs w:val="21"/>
           <w:lang w:eastAsia="zh-CN"/>
         </w:rPr>
-        <w:t>Surveymonkey</w:t>
-      </w:r>
-      <w:proofErr w:type="spellEnd"/>
+      </w:pPr>
       <w:r>
         <w:rPr>
           <w:rFonts w:asciiTheme="minorHAnsi" w:eastAsia="helvetica neue" w:hAnsiTheme="minorHAnsi" w:cstheme="minorHAnsi"/>
@@ -15631,9 +15998,29 @@
           <w:szCs w:val="21"/>
           <w:lang w:eastAsia="zh-CN"/>
         </w:rPr>
+        <w:t xml:space="preserve">Bitte füllen Sie folgende Umfrage über </w:t>
+      </w:r>
+      <w:proofErr w:type="spellStart"/>
+      <w:r>
+        <w:rPr>
+          <w:rFonts w:asciiTheme="minorHAnsi" w:eastAsia="helvetica neue" w:hAnsiTheme="minorHAnsi" w:cstheme="minorHAnsi"/>
+          <w:bCs w:val="0"/>
+          <w:szCs w:val="21"/>
+          <w:lang w:eastAsia="zh-CN"/>
+        </w:rPr>
+        <w:t>Surveymonkey</w:t>
+      </w:r>
+      <w:proofErr w:type="spellEnd"/>
+      <w:r>
+        <w:rPr>
+          <w:rFonts w:asciiTheme="minorHAnsi" w:eastAsia="helvetica neue" w:hAnsiTheme="minorHAnsi" w:cstheme="minorHAnsi"/>
+          <w:bCs w:val="0"/>
+          <w:szCs w:val="21"/>
+          <w:lang w:eastAsia="zh-CN"/>
+        </w:rPr>
         <w:t xml:space="preserve"> aus: </w:t>
       </w:r>
-      <w:hyperlink r:id="rId63" w:history="1">
+      <w:hyperlink r:id="rId65" w:history="1">
         <w:r>
           <w:rPr>
             <w:rStyle w:val="Hyperlink"/>
@@ -15713,7 +16100,7 @@
                     <pic:cNvPicPr/>
                   </pic:nvPicPr>
                   <pic:blipFill>
-                    <a:blip r:embed="rId64">
+                    <a:blip r:embed="rId66">
                       <a:extLst>
                         <a:ext uri="{28A0092B-C50C-407E-A947-70E740481C1C}">
                           <a14:useLocalDpi xmlns:a14="http://schemas.microsoft.com/office/drawing/2010/main" val="0"/>
@@ -15761,7 +16148,7 @@
         </w:rPr>
         <w:t xml:space="preserve">Sie können sich auch gerne unter </w:t>
       </w:r>
-      <w:hyperlink r:id="rId65" w:history="1">
+      <w:hyperlink r:id="rId67" w:history="1">
         <w:r>
           <w:rPr>
             <w:rFonts w:asciiTheme="minorHAnsi" w:eastAsia="helvetica neue" w:hAnsiTheme="minorHAnsi" w:cstheme="minorHAnsi"/>
@@ -15804,8 +16191,8 @@
       </w:pPr>
     </w:p>
     <w:sectPr>
-      <w:headerReference w:type="default" r:id="rId66"/>
-      <w:footerReference w:type="default" r:id="rId67"/>
+      <w:headerReference w:type="default" r:id="rId68"/>
+      <w:footerReference w:type="default" r:id="rId69"/>
       <w:pgSz w:w="11906" w:h="16838"/>
       <w:pgMar w:top="1134" w:right="1531" w:bottom="709" w:left="1531" w:header="709" w:footer="0" w:gutter="0"/>
       <w:cols w:space="708"/>
@@ -15813,6 +16200,45 @@
     </w:sectPr>
   </w:body>
 </w:document>
+</file>
+
+<file path=word/comments.xml><?xml version="1.0" encoding="utf-8"?>
+<w:comments xmlns:wpc="http://schemas.microsoft.com/office/word/2010/wordprocessingCanvas" xmlns:cx="http://schemas.microsoft.com/office/drawing/2014/chartex" xmlns:cx1="http://schemas.microsoft.com/office/drawing/2015/9/8/chartex" xmlns:cx2="http://schemas.microsoft.com/office/drawing/2015/10/21/chartex" xmlns:cx3="http://schemas.microsoft.com/office/drawing/2016/5/9/chartex" xmlns:cx4="http://schemas.microsoft.com/office/drawing/2016/5/10/chartex" xmlns:cx5="http://schemas.microsoft.com/office/drawing/2016/5/11/chartex" xmlns:cx6="http://schemas.microsoft.com/office/drawing/2016/5/12/chartex" xmlns:cx7="http://schemas.microsoft.com/office/drawing/2016/5/13/chartex" xmlns:cx8="http://schemas.microsoft.com/office/drawing/2016/5/14/chartex" xmlns:mc="http://schemas.openxmlformats.org/markup-compatibility/2006" xmlns:aink="http://schemas.microsoft.com/office/drawing/2016/ink" xmlns:am3d="http://schemas.microsoft.com/office/drawing/2017/model3d" xmlns:o="urn:schemas-microsoft-com:office:office" xmlns:oel="http://schemas.microsoft.com/office/2019/extlst" xmlns:r="http://schemas.openxmlformats.org/officeDocument/2006/relationships" xmlns:m="http://schemas.openxmlformats.org/officeDocument/2006/math" xmlns:v="urn:schemas-microsoft-com:vml" xmlns:wp14="http://schemas.microsoft.com/office/word/2010/wordprocessingDrawing" xmlns:wp="http://schemas.openxmlformats.org/drawingml/2006/wordprocessingDrawing" xmlns:w10="urn:schemas-microsoft-com:office:word" xmlns:w="http://schemas.openxmlformats.org/wordprocessingml/2006/main" xmlns:w14="http://schemas.microsoft.com/office/word/2010/wordml" xmlns:w15="http://schemas.microsoft.com/office/word/2012/wordml" xmlns:w16cex="http://schemas.microsoft.com/office/word/2018/wordml/cex" xmlns:w16cid="http://schemas.microsoft.com/office/word/2016/wordml/cid" xmlns:w16="http://schemas.microsoft.com/office/word/2018/wordml" xmlns:w16sdtdh="http://schemas.microsoft.com/office/word/2020/wordml/sdtdatahash" xmlns:w16se="http://schemas.microsoft.com/office/word/2015/wordml/symex" xmlns:wpg="http://schemas.microsoft.com/office/word/2010/wordprocessingGroup" xmlns:wpi="http://schemas.microsoft.com/office/word/2010/wordprocessingInk" xmlns:wne="http://schemas.microsoft.com/office/word/2006/wordml" xmlns:wps="http://schemas.microsoft.com/office/word/2010/wordprocessingShape" mc:Ignorable="w14 w15 w16se w16cid w16 w16cex w16sdtdh wp14">
+  <w:comment w:id="27" w:author="Imke Endjer" w:date="2023-02-22T11:21:00Z" w:initials="IE">
+    <w:p>
+      <w:pPr>
+        <w:pStyle w:val="Kommentartext"/>
+      </w:pPr>
+      <w:r>
+        <w:rPr>
+          <w:rStyle w:val="Kommentarzeichen"/>
+        </w:rPr>
+        <w:annotationRef/>
+      </w:r>
+      <w:r>
+        <w:t>Sollte hier nicht die Ziele aus dem One-Pager definiert werden?</w:t>
+      </w:r>
+    </w:p>
+  </w:comment>
+</w:comments>
+</file>
+
+<file path=word/commentsExtended.xml><?xml version="1.0" encoding="utf-8"?>
+<w15:commentsEx xmlns:wpc="http://schemas.microsoft.com/office/word/2010/wordprocessingCanvas" xmlns:cx="http://schemas.microsoft.com/office/drawing/2014/chartex" xmlns:cx1="http://schemas.microsoft.com/office/drawing/2015/9/8/chartex" xmlns:cx2="http://schemas.microsoft.com/office/drawing/2015/10/21/chartex" xmlns:cx3="http://schemas.microsoft.com/office/drawing/2016/5/9/chartex" xmlns:cx4="http://schemas.microsoft.com/office/drawing/2016/5/10/chartex" xmlns:cx5="http://schemas.microsoft.com/office/drawing/2016/5/11/chartex" xmlns:cx6="http://schemas.microsoft.com/office/drawing/2016/5/12/chartex" xmlns:cx7="http://schemas.microsoft.com/office/drawing/2016/5/13/chartex" xmlns:cx8="http://schemas.microsoft.com/office/drawing/2016/5/14/chartex" xmlns:mc="http://schemas.openxmlformats.org/markup-compatibility/2006" xmlns:aink="http://schemas.microsoft.com/office/drawing/2016/ink" xmlns:am3d="http://schemas.microsoft.com/office/drawing/2017/model3d" xmlns:o="urn:schemas-microsoft-com:office:office" xmlns:oel="http://schemas.microsoft.com/office/2019/extlst" xmlns:r="http://schemas.openxmlformats.org/officeDocument/2006/relationships" xmlns:m="http://schemas.openxmlformats.org/officeDocument/2006/math" xmlns:v="urn:schemas-microsoft-com:vml" xmlns:wp14="http://schemas.microsoft.com/office/word/2010/wordprocessingDrawing" xmlns:wp="http://schemas.openxmlformats.org/drawingml/2006/wordprocessingDrawing" xmlns:w10="urn:schemas-microsoft-com:office:word" xmlns:w="http://schemas.openxmlformats.org/wordprocessingml/2006/main" xmlns:w14="http://schemas.microsoft.com/office/word/2010/wordml" xmlns:w15="http://schemas.microsoft.com/office/word/2012/wordml" xmlns:w16cex="http://schemas.microsoft.com/office/word/2018/wordml/cex" xmlns:w16cid="http://schemas.microsoft.com/office/word/2016/wordml/cid" xmlns:w16="http://schemas.microsoft.com/office/word/2018/wordml" xmlns:w16sdtdh="http://schemas.microsoft.com/office/word/2020/wordml/sdtdatahash" xmlns:w16se="http://schemas.microsoft.com/office/word/2015/wordml/symex" xmlns:wpg="http://schemas.microsoft.com/office/word/2010/wordprocessingGroup" xmlns:wpi="http://schemas.microsoft.com/office/word/2010/wordprocessingInk" xmlns:wne="http://schemas.microsoft.com/office/word/2006/wordml" xmlns:wps="http://schemas.microsoft.com/office/word/2010/wordprocessingShape" mc:Ignorable="w14 w15 w16se w16cid w16 w16cex w16sdtdh wp14">
+  <w15:commentEx w15:paraId="6CBE5CC1" w15:done="0"/>
+</w15:commentsEx>
+</file>
+
+<file path=word/commentsExtensible.xml><?xml version="1.0" encoding="utf-8"?>
+<w16cex:commentsExtensible xmlns:wpc="http://schemas.microsoft.com/office/word/2010/wordprocessingCanvas" xmlns:cx="http://schemas.microsoft.com/office/drawing/2014/chartex" xmlns:cx1="http://schemas.microsoft.com/office/drawing/2015/9/8/chartex" xmlns:cx2="http://schemas.microsoft.com/office/drawing/2015/10/21/chartex" xmlns:cx3="http://schemas.microsoft.com/office/drawing/2016/5/9/chartex" xmlns:cx4="http://schemas.microsoft.com/office/drawing/2016/5/10/chartex" xmlns:cx5="http://schemas.microsoft.com/office/drawing/2016/5/11/chartex" xmlns:cx6="http://schemas.microsoft.com/office/drawing/2016/5/12/chartex" xmlns:cx7="http://schemas.microsoft.com/office/drawing/2016/5/13/chartex" xmlns:cx8="http://schemas.microsoft.com/office/drawing/2016/5/14/chartex" xmlns:mc="http://schemas.openxmlformats.org/markup-compatibility/2006" xmlns:aink="http://schemas.microsoft.com/office/drawing/2016/ink" xmlns:am3d="http://schemas.microsoft.com/office/drawing/2017/model3d" xmlns:o="urn:schemas-microsoft-com:office:office" xmlns:oel="http://schemas.microsoft.com/office/2019/extlst" xmlns:r="http://schemas.openxmlformats.org/officeDocument/2006/relationships" xmlns:m="http://schemas.openxmlformats.org/officeDocument/2006/math" xmlns:v="urn:schemas-microsoft-com:vml" xmlns:wp14="http://schemas.microsoft.com/office/word/2010/wordprocessingDrawing" xmlns:wp="http://schemas.openxmlformats.org/drawingml/2006/wordprocessingDrawing" xmlns:w10="urn:schemas-microsoft-com:office:word" xmlns:w="http://schemas.openxmlformats.org/wordprocessingml/2006/main" xmlns:w14="http://schemas.microsoft.com/office/word/2010/wordml" xmlns:w15="http://schemas.microsoft.com/office/word/2012/wordml" xmlns:w16cex="http://schemas.microsoft.com/office/word/2018/wordml/cex" xmlns:w16cid="http://schemas.microsoft.com/office/word/2016/wordml/cid" xmlns:w16="http://schemas.microsoft.com/office/word/2018/wordml" xmlns:w16sdtdh="http://schemas.microsoft.com/office/word/2020/wordml/sdtdatahash" xmlns:w16se="http://schemas.microsoft.com/office/word/2015/wordml/symex" xmlns:wpg="http://schemas.microsoft.com/office/word/2010/wordprocessingGroup" xmlns:wpi="http://schemas.microsoft.com/office/word/2010/wordprocessingInk" xmlns:wne="http://schemas.microsoft.com/office/word/2006/wordml" xmlns:wps="http://schemas.microsoft.com/office/word/2010/wordprocessingShape" mc:Ignorable="w14 w15 w16se w16cid w16 w16cex w16sdtdh wp14">
+  <w16cex:commentExtensible w16cex:durableId="27A0791F" w16cex:dateUtc="2023-02-22T10:21:00Z"/>
+</w16cex:commentsExtensible>
+</file>
+
+<file path=word/commentsIds.xml><?xml version="1.0" encoding="utf-8"?>
+<w16cid:commentsIds xmlns:wpc="http://schemas.microsoft.com/office/word/2010/wordprocessingCanvas" xmlns:cx="http://schemas.microsoft.com/office/drawing/2014/chartex" xmlns:cx1="http://schemas.microsoft.com/office/drawing/2015/9/8/chartex" xmlns:cx2="http://schemas.microsoft.com/office/drawing/2015/10/21/chartex" xmlns:cx3="http://schemas.microsoft.com/office/drawing/2016/5/9/chartex" xmlns:cx4="http://schemas.microsoft.com/office/drawing/2016/5/10/chartex" xmlns:cx5="http://schemas.microsoft.com/office/drawing/2016/5/11/chartex" xmlns:cx6="http://schemas.microsoft.com/office/drawing/2016/5/12/chartex" xmlns:cx7="http://schemas.microsoft.com/office/drawing/2016/5/13/chartex" xmlns:cx8="http://schemas.microsoft.com/office/drawing/2016/5/14/chartex" xmlns:mc="http://schemas.openxmlformats.org/markup-compatibility/2006" xmlns:aink="http://schemas.microsoft.com/office/drawing/2016/ink" xmlns:am3d="http://schemas.microsoft.com/office/drawing/2017/model3d" xmlns:o="urn:schemas-microsoft-com:office:office" xmlns:oel="http://schemas.microsoft.com/office/2019/extlst" xmlns:r="http://schemas.openxmlformats.org/officeDocument/2006/relationships" xmlns:m="http://schemas.openxmlformats.org/officeDocument/2006/math" xmlns:v="urn:schemas-microsoft-com:vml" xmlns:wp14="http://schemas.microsoft.com/office/word/2010/wordprocessingDrawing" xmlns:wp="http://schemas.openxmlformats.org/drawingml/2006/wordprocessingDrawing" xmlns:w10="urn:schemas-microsoft-com:office:word" xmlns:w="http://schemas.openxmlformats.org/wordprocessingml/2006/main" xmlns:w14="http://schemas.microsoft.com/office/word/2010/wordml" xmlns:w15="http://schemas.microsoft.com/office/word/2012/wordml" xmlns:w16cex="http://schemas.microsoft.com/office/word/2018/wordml/cex" xmlns:w16cid="http://schemas.microsoft.com/office/word/2016/wordml/cid" xmlns:w16="http://schemas.microsoft.com/office/word/2018/wordml" xmlns:w16sdtdh="http://schemas.microsoft.com/office/word/2020/wordml/sdtdatahash" xmlns:w16se="http://schemas.microsoft.com/office/word/2015/wordml/symex" xmlns:wpg="http://schemas.microsoft.com/office/word/2010/wordprocessingGroup" xmlns:wpi="http://schemas.microsoft.com/office/word/2010/wordprocessingInk" xmlns:wne="http://schemas.microsoft.com/office/word/2006/wordml" xmlns:wps="http://schemas.microsoft.com/office/word/2010/wordprocessingShape" mc:Ignorable="w14 w15 w16se w16cid w16 w16cex w16sdtdh wp14">
+  <w16cid:commentId w16cid:paraId="6CBE5CC1" w16cid:durableId="27A0791F"/>
+</w16cid:commentsIds>
 </file>
 
 <file path=word/endnotes.xml><?xml version="1.0" encoding="utf-8"?>
@@ -18970,8 +19396,8 @@
         <w:szCs w:val="18"/>
       </w:rPr>
     </w:pPr>
-    <w:bookmarkStart w:id="44" w:name="_Hlk58245454"/>
-    <w:bookmarkStart w:id="45" w:name="_Hlk58245455"/>
+    <w:bookmarkStart w:id="64" w:name="_Hlk58245454"/>
+    <w:bookmarkStart w:id="65" w:name="_Hlk58245455"/>
     <w:r>
       <w:rPr>
         <w:noProof/>
@@ -19291,8 +19717,8 @@
       <w:t xml:space="preserve">         </w:t>
     </w:r>
   </w:p>
-  <w:bookmarkEnd w:id="44"/>
-  <w:bookmarkEnd w:id="45"/>
+  <w:bookmarkEnd w:id="64"/>
+  <w:bookmarkEnd w:id="65"/>
   <w:p>
     <w:pPr>
       <w:pStyle w:val="Fuzeile"/>
@@ -21868,7 +22294,15 @@
         <w:footnoteRef/>
       </w:r>
       <w:r>
-        <w:t xml:space="preserve"> Der Computer könnte in unserem Beispiel auch direkt mit den Bilder arbeiten, wie das etwa bei Bilderkennung bzw. Klassifikation von Bildern der Fall ist. Allerdings liegen viele Daten in tabellarischer Form vor, wie auch in den späteren Beispielen in diesem Modul. Auch dort werden die für den Anwendungsfall relevanten Merkmale aus der „echten Welt“ erfasst und für den Computer verarbeitbar gemacht.</w:t>
+        <w:t xml:space="preserve"> Der Computer könnte in unserem Beispiel auch direkt </w:t>
+      </w:r>
+      <w:proofErr w:type="gramStart"/>
+      <w:r>
+        <w:t>mit den Bilder</w:t>
+      </w:r>
+      <w:proofErr w:type="gramEnd"/>
+      <w:r>
+        <w:t xml:space="preserve"> arbeiten, wie das etwa bei Bilderkennung bzw. Klassifikation von Bildern der Fall ist. Allerdings liegen viele Daten in tabellarischer Form vor, wie auch in den späteren Beispielen in diesem Modul. Auch dort werden die für den Anwendungsfall relevanten Merkmale aus der „echten Welt“ erfasst und für den Computer verarbeitbar gemacht.</w:t>
       </w:r>
     </w:p>
   </w:footnote>
@@ -21936,8 +22370,8 @@
         <w:vertAlign w:val="subscript"/>
       </w:rPr>
     </w:pPr>
-    <w:bookmarkStart w:id="42" w:name="_Hlk58245611"/>
-    <w:bookmarkStart w:id="43" w:name="_Hlk58245612"/>
+    <w:bookmarkStart w:id="62" w:name="_Hlk58245611"/>
+    <w:bookmarkStart w:id="63" w:name="_Hlk58245612"/>
     <w:r>
       <w:rPr>
         <w:noProof/>
@@ -22038,8 +22472,8 @@
       </w:rPr>
       <w:tab/>
     </w:r>
-    <w:bookmarkEnd w:id="42"/>
-    <w:bookmarkEnd w:id="43"/>
+    <w:bookmarkEnd w:id="62"/>
+    <w:bookmarkEnd w:id="63"/>
   </w:p>
   <w:p>
     <w:pPr>
@@ -26183,6 +26617,14 @@
   </w:num>
   <w:numIdMacAtCleanup w:val="20"/>
 </w:numbering>
+</file>
+
+<file path=word/people.xml><?xml version="1.0" encoding="utf-8"?>
+<w15:people xmlns:wpc="http://schemas.microsoft.com/office/word/2010/wordprocessingCanvas" xmlns:cx="http://schemas.microsoft.com/office/drawing/2014/chartex" xmlns:cx1="http://schemas.microsoft.com/office/drawing/2015/9/8/chartex" xmlns:cx2="http://schemas.microsoft.com/office/drawing/2015/10/21/chartex" xmlns:cx3="http://schemas.microsoft.com/office/drawing/2016/5/9/chartex" xmlns:cx4="http://schemas.microsoft.com/office/drawing/2016/5/10/chartex" xmlns:cx5="http://schemas.microsoft.com/office/drawing/2016/5/11/chartex" xmlns:cx6="http://schemas.microsoft.com/office/drawing/2016/5/12/chartex" xmlns:cx7="http://schemas.microsoft.com/office/drawing/2016/5/13/chartex" xmlns:cx8="http://schemas.microsoft.com/office/drawing/2016/5/14/chartex" xmlns:mc="http://schemas.openxmlformats.org/markup-compatibility/2006" xmlns:aink="http://schemas.microsoft.com/office/drawing/2016/ink" xmlns:am3d="http://schemas.microsoft.com/office/drawing/2017/model3d" xmlns:o="urn:schemas-microsoft-com:office:office" xmlns:oel="http://schemas.microsoft.com/office/2019/extlst" xmlns:r="http://schemas.openxmlformats.org/officeDocument/2006/relationships" xmlns:m="http://schemas.openxmlformats.org/officeDocument/2006/math" xmlns:v="urn:schemas-microsoft-com:vml" xmlns:wp14="http://schemas.microsoft.com/office/word/2010/wordprocessingDrawing" xmlns:wp="http://schemas.openxmlformats.org/drawingml/2006/wordprocessingDrawing" xmlns:w10="urn:schemas-microsoft-com:office:word" xmlns:w="http://schemas.openxmlformats.org/wordprocessingml/2006/main" xmlns:w14="http://schemas.microsoft.com/office/word/2010/wordml" xmlns:w15="http://schemas.microsoft.com/office/word/2012/wordml" xmlns:w16cex="http://schemas.microsoft.com/office/word/2018/wordml/cex" xmlns:w16cid="http://schemas.microsoft.com/office/word/2016/wordml/cid" xmlns:w16="http://schemas.microsoft.com/office/word/2018/wordml" xmlns:w16sdtdh="http://schemas.microsoft.com/office/word/2020/wordml/sdtdatahash" xmlns:w16se="http://schemas.microsoft.com/office/word/2015/wordml/symex" xmlns:wpg="http://schemas.microsoft.com/office/word/2010/wordprocessingGroup" xmlns:wpi="http://schemas.microsoft.com/office/word/2010/wordprocessingInk" xmlns:wne="http://schemas.microsoft.com/office/word/2006/wordml" xmlns:wps="http://schemas.microsoft.com/office/word/2010/wordprocessingShape" mc:Ignorable="w14 w15 w16se w16cid w16 w16cex w16sdtdh wp14">
+  <w15:person w15:author="Imke Endjer">
+    <w15:presenceInfo w15:providerId="AD" w15:userId="S::imke.endjer@uni-oldenburg.de::1afa6594-d4a8-48a2-b73b-6dd640e31d31"/>
+  </w15:person>
+</w15:people>
 </file>
 
 <file path=word/styles.xml><?xml version="1.0" encoding="utf-8"?>
@@ -39273,6 +39715,21 @@
       <w:u w:val="single"/>
     </w:rPr>
   </w:style>
+  <w:style w:type="paragraph" w:styleId="berarbeitung">
+    <w:name w:val="Revision"/>
+    <w:hidden/>
+    <w:uiPriority w:val="99"/>
+    <w:semiHidden/>
+    <w:rsid w:val="00C9294A"/>
+    <w:pPr>
+      <w:spacing w:after="0" w:line="240" w:lineRule="auto"/>
+    </w:pPr>
+    <w:rPr>
+      <w:bCs/>
+      <w:sz w:val="21"/>
+      <w:lang w:eastAsia="de-DE"/>
+    </w:rPr>
+  </w:style>
 </w:styles>
 </file>
 
@@ -39485,27 +39942,27 @@
 </file>
 
 <file path=customXml/item1.xml><?xml version="1.0" encoding="utf-8"?>
-<b:Sources xmlns:b="http://schemas.openxmlformats.org/officeDocument/2006/bibliography" xmlns="http://schemas.openxmlformats.org/officeDocument/2006/bibliography" SelectedStyle="\APASixthEditionOfficeOnline.xsl" StyleName="APA" Version="6"/>
-</file>
-
-<file path=customXml/item2.xml><?xml version="1.0" encoding="utf-8"?>
 <w:settings xmlns:w="http://schemas.openxmlformats.org/wordprocessingml/2006/main">
   <w:SpecialFormsHighlight w:val="c9c8ff"/>
 </w:settings>
 </file>
 
+<file path=customXml/item2.xml><?xml version="1.0" encoding="utf-8"?>
+<b:Sources xmlns:b="http://schemas.openxmlformats.org/officeDocument/2006/bibliography" xmlns="http://schemas.openxmlformats.org/officeDocument/2006/bibliography" SelectedStyle="\APASixthEditionOfficeOnline.xsl" StyleName="APA" Version="6"/>
+</file>
+
 <file path=customXml/itemProps1.xml><?xml version="1.0" encoding="utf-8"?>
+<ds:datastoreItem xmlns:ds="http://schemas.openxmlformats.org/officeDocument/2006/customXml" ds:itemID="{5D0AEA6B-E499-4EEF-98A3-AFBB261C493E}">
+  <ds:schemaRefs>
+    <ds:schemaRef ds:uri="http://schemas.openxmlformats.org/wordprocessingml/2006/main"/>
+  </ds:schemaRefs>
+</ds:datastoreItem>
+</file>
+
+<file path=customXml/itemProps2.xml><?xml version="1.0" encoding="utf-8"?>
 <ds:datastoreItem xmlns:ds="http://schemas.openxmlformats.org/officeDocument/2006/customXml" ds:itemID="{9C860D40-E240-455F-A689-7AD4F0BFC951}">
   <ds:schemaRefs>
     <ds:schemaRef ds:uri="http://schemas.openxmlformats.org/officeDocument/2006/bibliography"/>
   </ds:schemaRefs>
 </ds:datastoreItem>
-</file>
-
-<file path=customXml/itemProps2.xml><?xml version="1.0" encoding="utf-8"?>
-<ds:datastoreItem xmlns:ds="http://schemas.openxmlformats.org/officeDocument/2006/customXml" ds:itemID="{5D0AEA6B-E499-4EEF-98A3-AFBB261C493E}">
-  <ds:schemaRefs>
-    <ds:schemaRef ds:uri="http://schemas.openxmlformats.org/wordprocessingml/2006/main"/>
-  </ds:schemaRefs>
-</ds:datastoreItem>
 </file>
</xml_diff>